<commit_message>
chore: eliminación de antiguo banner
</commit_message>
<xml_diff>
--- a/03-disenio/02-Estructura-del-proyecto/Estructura-del-proyecto.docx
+++ b/03-disenio/02-Estructura-del-proyecto/Estructura-del-proyecto.docx
@@ -614,7 +614,15 @@
         <w:rPr>
           <w:rFonts w:ascii="Arial" w:hAnsi="Arial" w:cs="Arial"/>
         </w:rPr>
-        <w:t>Junio</w:t>
+        <w:t>25 de j</w:t>
+      </w:r>
+      <w:bookmarkStart w:id="0" w:name="_GoBack"/>
+      <w:bookmarkEnd w:id="0"/>
+      <w:r>
+        <w:rPr>
+          <w:rFonts w:ascii="Arial" w:hAnsi="Arial" w:cs="Arial"/>
+        </w:rPr>
+        <w:t>unio</w:t>
       </w:r>
       <w:r>
         <w:rPr>
@@ -699,6 +707,7 @@
       <w:r>
         <w:rPr>
           <w:rFonts w:ascii="Arial" w:hAnsi="Arial" w:cs="Arial"/>
+          <w:noProof/>
           <w:sz w:val="24"/>
           <w:szCs w:val="24"/>
         </w:rPr>
@@ -1074,6 +1083,9 @@
         </w:rPr>
       </w:pPr>
       <w:r>
+        <w:rPr>
+          <w:noProof/>
+        </w:rPr>
         <w:lastRenderedPageBreak/>
         <w:drawing>
           <wp:anchor distT="0" distB="0" distL="114300" distR="114300" simplePos="0" relativeHeight="251659264" behindDoc="1" locked="0" layoutInCell="1" allowOverlap="1" wp14:anchorId="6CDDD512" wp14:editId="70278A8E">
@@ -1445,27 +1457,16 @@
           <w:szCs w:val="24"/>
         </w:rPr>
       </w:pPr>
-    </w:p>
-    <w:p>
-      <w:pPr>
-        <w:spacing w:line="360" w:lineRule="auto"/>
-        <w:jc w:val="both"/>
-        <w:rPr>
-          <w:rFonts w:ascii="Arial" w:hAnsi="Arial" w:cs="Arial"/>
-          <w:b/>
-          <w:bCs/>
-          <w:sz w:val="24"/>
-          <w:szCs w:val="24"/>
-        </w:rPr>
-      </w:pPr>
-      <w:r>
-        <w:rPr>
-          <w:rFonts w:ascii="Arial" w:hAnsi="Arial" w:cs="Arial"/>
-          <w:b/>
-          <w:bCs/>
-          <w:sz w:val="24"/>
-          <w:szCs w:val="24"/>
-        </w:rPr>
+      <w:r>
+        <w:rPr>
+          <w:rFonts w:ascii="Arial" w:hAnsi="Arial" w:cs="Arial"/>
+          <w:b/>
+          <w:bCs/>
+          <w:noProof/>
+          <w:sz w:val="24"/>
+          <w:szCs w:val="24"/>
+        </w:rPr>
+        <w:lastRenderedPageBreak/>
         <w:drawing>
           <wp:anchor distT="0" distB="0" distL="114300" distR="114300" simplePos="0" relativeHeight="251660288" behindDoc="1" locked="0" layoutInCell="1" allowOverlap="1" wp14:anchorId="7A32528D" wp14:editId="77C84A85">
             <wp:simplePos x="0" y="0"/>
@@ -1869,21 +1870,42 @@
         <w:jc w:val="both"/>
         <w:rPr>
           <w:rFonts w:ascii="Arial" w:hAnsi="Arial" w:cs="Arial"/>
-          <w:b/>
-          <w:bCs/>
-          <w:sz w:val="24"/>
-          <w:szCs w:val="24"/>
-        </w:rPr>
-      </w:pPr>
-      <w:r>
-        <w:rPr>
-          <w:rFonts w:ascii="Arial" w:hAnsi="Arial" w:cs="Arial"/>
-          <w:b/>
-          <w:bCs/>
-          <w:sz w:val="24"/>
-          <w:szCs w:val="24"/>
-        </w:rPr>
-        <w:lastRenderedPageBreak/>
+          <w:sz w:val="24"/>
+          <w:szCs w:val="24"/>
+        </w:rPr>
+      </w:pPr>
+    </w:p>
+    <w:p>
+      <w:pPr>
+        <w:spacing w:line="360" w:lineRule="auto"/>
+        <w:jc w:val="both"/>
+        <w:rPr>
+          <w:rFonts w:ascii="Arial" w:hAnsi="Arial" w:cs="Arial"/>
+          <w:sz w:val="24"/>
+          <w:szCs w:val="24"/>
+        </w:rPr>
+      </w:pPr>
+    </w:p>
+    <w:p>
+      <w:pPr>
+        <w:spacing w:line="360" w:lineRule="auto"/>
+        <w:jc w:val="both"/>
+        <w:rPr>
+          <w:rFonts w:ascii="Arial" w:hAnsi="Arial" w:cs="Arial"/>
+          <w:b/>
+          <w:bCs/>
+          <w:sz w:val="24"/>
+          <w:szCs w:val="24"/>
+        </w:rPr>
+      </w:pPr>
+      <w:r>
+        <w:rPr>
+          <w:rFonts w:ascii="Arial" w:hAnsi="Arial" w:cs="Arial"/>
+          <w:b/>
+          <w:bCs/>
+          <w:sz w:val="24"/>
+          <w:szCs w:val="24"/>
+        </w:rPr>
         <w:t xml:space="preserve">4. ESTRUCTURA DE LA CARPETA </w:t>
       </w:r>
       <w:r>
@@ -1906,26 +1928,25 @@
         </w:rPr>
         <w:t>:</w:t>
       </w:r>
-      <w:bookmarkStart w:id="0" w:name="_GoBack"/>
-      <w:bookmarkEnd w:id="0"/>
-    </w:p>
-    <w:p>
-      <w:pPr>
-        <w:spacing w:line="360" w:lineRule="auto"/>
-        <w:jc w:val="both"/>
-        <w:rPr>
-          <w:rFonts w:ascii="Arial" w:hAnsi="Arial" w:cs="Arial"/>
-          <w:b/>
-          <w:bCs/>
-          <w:sz w:val="24"/>
-          <w:szCs w:val="24"/>
-        </w:rPr>
-      </w:pPr>
-      <w:r>
-        <w:rPr>
-          <w:rFonts w:ascii="Arial" w:hAnsi="Arial" w:cs="Arial"/>
-          <w:b/>
-          <w:bCs/>
+    </w:p>
+    <w:p>
+      <w:pPr>
+        <w:spacing w:line="360" w:lineRule="auto"/>
+        <w:jc w:val="both"/>
+        <w:rPr>
+          <w:rFonts w:ascii="Arial" w:hAnsi="Arial" w:cs="Arial"/>
+          <w:b/>
+          <w:bCs/>
+          <w:sz w:val="24"/>
+          <w:szCs w:val="24"/>
+        </w:rPr>
+      </w:pPr>
+      <w:r>
+        <w:rPr>
+          <w:rFonts w:ascii="Arial" w:hAnsi="Arial" w:cs="Arial"/>
+          <w:b/>
+          <w:bCs/>
+          <w:noProof/>
           <w:sz w:val="24"/>
           <w:szCs w:val="24"/>
         </w:rPr>
@@ -2033,506 +2054,1454 @@
         <w:jc w:val="both"/>
         <w:rPr>
           <w:rFonts w:ascii="Arial" w:hAnsi="Arial" w:cs="Arial"/>
-          <w:b/>
-          <w:bCs/>
-          <w:sz w:val="24"/>
-          <w:szCs w:val="24"/>
-        </w:rPr>
-      </w:pPr>
-    </w:p>
-    <w:p>
-      <w:pPr>
-        <w:spacing w:line="360" w:lineRule="auto"/>
-        <w:jc w:val="both"/>
-        <w:rPr>
-          <w:rFonts w:ascii="Arial" w:hAnsi="Arial" w:cs="Arial"/>
-          <w:b/>
-          <w:bCs/>
-          <w:sz w:val="24"/>
-          <w:szCs w:val="24"/>
-        </w:rPr>
-      </w:pPr>
-    </w:p>
-    <w:p>
-      <w:pPr>
-        <w:spacing w:line="360" w:lineRule="auto"/>
-        <w:jc w:val="both"/>
-        <w:rPr>
-          <w:rFonts w:ascii="Arial" w:hAnsi="Arial" w:cs="Arial"/>
-          <w:b/>
-          <w:bCs/>
-          <w:sz w:val="24"/>
-          <w:szCs w:val="24"/>
-        </w:rPr>
-      </w:pPr>
-    </w:p>
-    <w:p>
-      <w:pPr>
-        <w:spacing w:line="360" w:lineRule="auto"/>
-        <w:jc w:val="both"/>
-        <w:rPr>
-          <w:rFonts w:ascii="Arial" w:hAnsi="Arial" w:cs="Arial"/>
-          <w:b/>
-          <w:bCs/>
-          <w:sz w:val="24"/>
-          <w:szCs w:val="24"/>
-        </w:rPr>
-      </w:pPr>
-    </w:p>
-    <w:p>
-      <w:pPr>
-        <w:spacing w:line="360" w:lineRule="auto"/>
-        <w:jc w:val="both"/>
-        <w:rPr>
-          <w:rFonts w:ascii="Arial" w:hAnsi="Arial" w:cs="Arial"/>
-          <w:b/>
-          <w:bCs/>
-          <w:sz w:val="24"/>
-          <w:szCs w:val="24"/>
-        </w:rPr>
-      </w:pPr>
-    </w:p>
-    <w:p>
-      <w:pPr>
-        <w:spacing w:line="360" w:lineRule="auto"/>
-        <w:jc w:val="both"/>
-        <w:rPr>
-          <w:rFonts w:ascii="Arial" w:hAnsi="Arial" w:cs="Arial"/>
-          <w:b/>
-          <w:bCs/>
-          <w:sz w:val="24"/>
-          <w:szCs w:val="24"/>
-        </w:rPr>
-      </w:pPr>
-    </w:p>
-    <w:p>
-      <w:pPr>
-        <w:spacing w:line="360" w:lineRule="auto"/>
-        <w:jc w:val="both"/>
-        <w:rPr>
-          <w:rFonts w:ascii="Arial" w:hAnsi="Arial" w:cs="Arial"/>
-          <w:b/>
-          <w:bCs/>
-          <w:sz w:val="24"/>
-          <w:szCs w:val="24"/>
-        </w:rPr>
-      </w:pPr>
-    </w:p>
-    <w:p>
-      <w:pPr>
-        <w:spacing w:line="360" w:lineRule="auto"/>
-        <w:jc w:val="both"/>
-        <w:rPr>
-          <w:rFonts w:ascii="Arial" w:hAnsi="Arial" w:cs="Arial"/>
-          <w:b/>
-          <w:bCs/>
-          <w:sz w:val="24"/>
-          <w:szCs w:val="24"/>
-        </w:rPr>
-      </w:pPr>
-    </w:p>
-    <w:p>
-      <w:pPr>
-        <w:spacing w:line="360" w:lineRule="auto"/>
-        <w:jc w:val="both"/>
-        <w:rPr>
-          <w:rFonts w:ascii="Arial" w:hAnsi="Arial" w:cs="Arial"/>
-          <w:b/>
-          <w:bCs/>
-          <w:sz w:val="24"/>
-          <w:szCs w:val="24"/>
-        </w:rPr>
-      </w:pPr>
-    </w:p>
-    <w:p>
-      <w:pPr>
-        <w:spacing w:line="360" w:lineRule="auto"/>
-        <w:jc w:val="both"/>
-        <w:rPr>
-          <w:rFonts w:ascii="Arial" w:hAnsi="Arial" w:cs="Arial"/>
-          <w:b/>
-          <w:bCs/>
-          <w:sz w:val="24"/>
-          <w:szCs w:val="24"/>
-        </w:rPr>
-      </w:pPr>
-    </w:p>
-    <w:p>
-      <w:pPr>
-        <w:spacing w:line="360" w:lineRule="auto"/>
-        <w:jc w:val="both"/>
-        <w:rPr>
-          <w:rFonts w:ascii="Arial" w:hAnsi="Arial" w:cs="Arial"/>
-          <w:b/>
-          <w:bCs/>
-          <w:sz w:val="24"/>
-          <w:szCs w:val="24"/>
-        </w:rPr>
-      </w:pPr>
-    </w:p>
-    <w:p>
-      <w:pPr>
-        <w:spacing w:line="360" w:lineRule="auto"/>
-        <w:jc w:val="both"/>
-        <w:rPr>
-          <w:rFonts w:ascii="Arial" w:hAnsi="Arial" w:cs="Arial"/>
-          <w:b/>
-          <w:bCs/>
-          <w:sz w:val="24"/>
-          <w:szCs w:val="24"/>
-        </w:rPr>
-      </w:pPr>
-    </w:p>
-    <w:p>
-      <w:pPr>
-        <w:spacing w:line="360" w:lineRule="auto"/>
-        <w:jc w:val="both"/>
-        <w:rPr>
-          <w:rFonts w:ascii="Arial" w:hAnsi="Arial" w:cs="Arial"/>
-          <w:b/>
-          <w:bCs/>
-          <w:sz w:val="24"/>
-          <w:szCs w:val="24"/>
-        </w:rPr>
-      </w:pPr>
-    </w:p>
-    <w:p>
-      <w:pPr>
-        <w:spacing w:line="360" w:lineRule="auto"/>
-        <w:jc w:val="both"/>
-        <w:rPr>
-          <w:rFonts w:ascii="Arial" w:hAnsi="Arial" w:cs="Arial"/>
-          <w:b/>
-          <w:bCs/>
-          <w:sz w:val="24"/>
-          <w:szCs w:val="24"/>
-        </w:rPr>
-      </w:pPr>
-    </w:p>
-    <w:p>
-      <w:pPr>
-        <w:spacing w:line="360" w:lineRule="auto"/>
-        <w:jc w:val="both"/>
-        <w:rPr>
-          <w:rFonts w:ascii="Arial" w:hAnsi="Arial" w:cs="Arial"/>
-          <w:b/>
-          <w:bCs/>
-          <w:sz w:val="24"/>
-          <w:szCs w:val="24"/>
-        </w:rPr>
-      </w:pPr>
-    </w:p>
-    <w:p>
-      <w:pPr>
-        <w:spacing w:line="360" w:lineRule="auto"/>
-        <w:jc w:val="both"/>
-        <w:rPr>
-          <w:rFonts w:ascii="Arial" w:hAnsi="Arial" w:cs="Arial"/>
-          <w:b/>
-          <w:bCs/>
-          <w:sz w:val="24"/>
-          <w:szCs w:val="24"/>
-        </w:rPr>
-      </w:pPr>
-    </w:p>
-    <w:p>
-      <w:pPr>
-        <w:spacing w:line="360" w:lineRule="auto"/>
-        <w:jc w:val="both"/>
-        <w:rPr>
-          <w:rFonts w:ascii="Arial" w:hAnsi="Arial" w:cs="Arial"/>
-          <w:b/>
-          <w:bCs/>
-          <w:sz w:val="24"/>
-          <w:szCs w:val="24"/>
-        </w:rPr>
-      </w:pPr>
-    </w:p>
-    <w:p>
-      <w:pPr>
-        <w:spacing w:line="360" w:lineRule="auto"/>
-        <w:jc w:val="both"/>
-        <w:rPr>
-          <w:rFonts w:ascii="Arial" w:hAnsi="Arial" w:cs="Arial"/>
-          <w:b/>
-          <w:bCs/>
-          <w:sz w:val="24"/>
-          <w:szCs w:val="24"/>
-        </w:rPr>
-      </w:pPr>
-    </w:p>
-    <w:p>
-      <w:pPr>
-        <w:spacing w:line="360" w:lineRule="auto"/>
-        <w:jc w:val="both"/>
-        <w:rPr>
-          <w:rFonts w:ascii="Arial" w:hAnsi="Arial" w:cs="Arial"/>
-          <w:b/>
-          <w:bCs/>
-          <w:sz w:val="24"/>
-          <w:szCs w:val="24"/>
-        </w:rPr>
-      </w:pPr>
-    </w:p>
-    <w:p>
-      <w:pPr>
-        <w:spacing w:line="360" w:lineRule="auto"/>
-        <w:jc w:val="both"/>
-        <w:rPr>
-          <w:rFonts w:ascii="Arial" w:hAnsi="Arial" w:cs="Arial"/>
-          <w:b/>
-          <w:bCs/>
-          <w:sz w:val="24"/>
-          <w:szCs w:val="24"/>
-        </w:rPr>
-      </w:pPr>
-    </w:p>
-    <w:p>
-      <w:pPr>
-        <w:spacing w:line="360" w:lineRule="auto"/>
-        <w:jc w:val="both"/>
-        <w:rPr>
-          <w:rFonts w:ascii="Arial" w:hAnsi="Arial" w:cs="Arial"/>
-          <w:b/>
-          <w:bCs/>
-          <w:sz w:val="24"/>
-          <w:szCs w:val="24"/>
-        </w:rPr>
-      </w:pPr>
-    </w:p>
-    <w:p>
-      <w:pPr>
-        <w:spacing w:line="360" w:lineRule="auto"/>
-        <w:jc w:val="both"/>
-        <w:rPr>
-          <w:rFonts w:ascii="Arial" w:hAnsi="Arial" w:cs="Arial"/>
-          <w:b/>
-          <w:bCs/>
-          <w:sz w:val="24"/>
-          <w:szCs w:val="24"/>
-        </w:rPr>
-      </w:pPr>
-    </w:p>
-    <w:p>
-      <w:pPr>
-        <w:spacing w:line="360" w:lineRule="auto"/>
-        <w:jc w:val="both"/>
-        <w:rPr>
-          <w:rFonts w:ascii="Arial" w:hAnsi="Arial" w:cs="Arial"/>
-          <w:b/>
-          <w:bCs/>
-          <w:sz w:val="24"/>
-          <w:szCs w:val="24"/>
-        </w:rPr>
-      </w:pPr>
-    </w:p>
-    <w:p>
-      <w:pPr>
-        <w:spacing w:line="360" w:lineRule="auto"/>
-        <w:jc w:val="both"/>
-        <w:rPr>
-          <w:rFonts w:ascii="Arial" w:hAnsi="Arial" w:cs="Arial"/>
-          <w:b/>
-          <w:bCs/>
-          <w:sz w:val="24"/>
-          <w:szCs w:val="24"/>
-        </w:rPr>
-      </w:pPr>
-    </w:p>
-    <w:p>
-      <w:pPr>
-        <w:spacing w:line="360" w:lineRule="auto"/>
-        <w:jc w:val="both"/>
-        <w:rPr>
-          <w:rFonts w:ascii="Arial" w:hAnsi="Arial" w:cs="Arial"/>
-          <w:b/>
-          <w:bCs/>
-          <w:sz w:val="24"/>
-          <w:szCs w:val="24"/>
-        </w:rPr>
-      </w:pPr>
-    </w:p>
-    <w:p>
-      <w:pPr>
-        <w:spacing w:line="360" w:lineRule="auto"/>
-        <w:jc w:val="both"/>
-        <w:rPr>
-          <w:rFonts w:ascii="Arial" w:hAnsi="Arial" w:cs="Arial"/>
-          <w:b/>
-          <w:bCs/>
-          <w:sz w:val="24"/>
-          <w:szCs w:val="24"/>
-        </w:rPr>
-      </w:pPr>
-    </w:p>
-    <w:p>
-      <w:pPr>
-        <w:spacing w:line="360" w:lineRule="auto"/>
-        <w:jc w:val="both"/>
-        <w:rPr>
-          <w:rFonts w:ascii="Arial" w:hAnsi="Arial" w:cs="Arial"/>
-          <w:b/>
-          <w:bCs/>
-          <w:sz w:val="24"/>
-          <w:szCs w:val="24"/>
-        </w:rPr>
-      </w:pPr>
-    </w:p>
-    <w:p>
-      <w:pPr>
-        <w:spacing w:line="360" w:lineRule="auto"/>
-        <w:jc w:val="both"/>
-        <w:rPr>
-          <w:rFonts w:ascii="Arial" w:hAnsi="Arial" w:cs="Arial"/>
-          <w:b/>
-          <w:bCs/>
-          <w:sz w:val="24"/>
-          <w:szCs w:val="24"/>
-        </w:rPr>
-      </w:pPr>
-    </w:p>
-    <w:p>
-      <w:pPr>
-        <w:spacing w:line="360" w:lineRule="auto"/>
-        <w:jc w:val="both"/>
-        <w:rPr>
-          <w:rFonts w:ascii="Arial" w:hAnsi="Arial" w:cs="Arial"/>
-          <w:b/>
-          <w:bCs/>
-          <w:sz w:val="24"/>
-          <w:szCs w:val="24"/>
-        </w:rPr>
-      </w:pPr>
-    </w:p>
-    <w:p>
-      <w:pPr>
-        <w:spacing w:line="360" w:lineRule="auto"/>
-        <w:jc w:val="both"/>
-        <w:rPr>
-          <w:rFonts w:ascii="Arial" w:hAnsi="Arial" w:cs="Arial"/>
-          <w:b/>
-          <w:bCs/>
-          <w:sz w:val="24"/>
-          <w:szCs w:val="24"/>
-        </w:rPr>
-      </w:pPr>
-    </w:p>
-    <w:p>
-      <w:pPr>
-        <w:spacing w:line="360" w:lineRule="auto"/>
-        <w:jc w:val="both"/>
-        <w:rPr>
-          <w:rFonts w:ascii="Arial" w:hAnsi="Arial" w:cs="Arial"/>
-          <w:b/>
-          <w:bCs/>
-          <w:sz w:val="24"/>
-          <w:szCs w:val="24"/>
-        </w:rPr>
-      </w:pPr>
-    </w:p>
-    <w:p>
-      <w:pPr>
-        <w:spacing w:line="360" w:lineRule="auto"/>
-        <w:jc w:val="both"/>
-        <w:rPr>
-          <w:rFonts w:ascii="Arial" w:hAnsi="Arial" w:cs="Arial"/>
-          <w:b/>
-          <w:bCs/>
-          <w:sz w:val="24"/>
-          <w:szCs w:val="24"/>
-        </w:rPr>
-      </w:pPr>
-    </w:p>
-    <w:p>
-      <w:pPr>
-        <w:spacing w:line="360" w:lineRule="auto"/>
-        <w:jc w:val="both"/>
-        <w:rPr>
-          <w:rFonts w:ascii="Arial" w:hAnsi="Arial" w:cs="Arial"/>
-          <w:b/>
-          <w:bCs/>
-          <w:sz w:val="24"/>
-          <w:szCs w:val="24"/>
-        </w:rPr>
-      </w:pPr>
-    </w:p>
-    <w:p>
-      <w:pPr>
-        <w:spacing w:line="360" w:lineRule="auto"/>
-        <w:jc w:val="both"/>
-        <w:rPr>
-          <w:rFonts w:ascii="Arial" w:hAnsi="Arial" w:cs="Arial"/>
-          <w:b/>
-          <w:bCs/>
-          <w:sz w:val="24"/>
-          <w:szCs w:val="24"/>
-        </w:rPr>
-      </w:pPr>
-    </w:p>
-    <w:p>
-      <w:pPr>
-        <w:spacing w:line="360" w:lineRule="auto"/>
-        <w:jc w:val="both"/>
-        <w:rPr>
-          <w:rFonts w:ascii="Arial" w:hAnsi="Arial" w:cs="Arial"/>
-          <w:b/>
-          <w:bCs/>
-          <w:sz w:val="24"/>
-          <w:szCs w:val="24"/>
-        </w:rPr>
-      </w:pPr>
-    </w:p>
-    <w:p>
-      <w:pPr>
-        <w:spacing w:line="360" w:lineRule="auto"/>
-        <w:jc w:val="both"/>
-        <w:rPr>
-          <w:rFonts w:ascii="Arial" w:hAnsi="Arial" w:cs="Arial"/>
-          <w:b/>
-          <w:bCs/>
-          <w:sz w:val="24"/>
-          <w:szCs w:val="24"/>
-        </w:rPr>
-      </w:pPr>
-    </w:p>
-    <w:p>
-      <w:pPr>
-        <w:spacing w:line="360" w:lineRule="auto"/>
-        <w:jc w:val="both"/>
-        <w:rPr>
-          <w:rFonts w:ascii="Arial" w:hAnsi="Arial" w:cs="Arial"/>
-          <w:b/>
-          <w:bCs/>
-          <w:sz w:val="24"/>
-          <w:szCs w:val="24"/>
-        </w:rPr>
-      </w:pPr>
-    </w:p>
-    <w:p>
-      <w:pPr>
-        <w:spacing w:line="360" w:lineRule="auto"/>
-        <w:jc w:val="both"/>
-        <w:rPr>
-          <w:rFonts w:ascii="Arial" w:hAnsi="Arial" w:cs="Arial"/>
-          <w:b/>
-          <w:bCs/>
-          <w:sz w:val="24"/>
-          <w:szCs w:val="24"/>
-        </w:rPr>
-      </w:pPr>
-    </w:p>
-    <w:p>
-      <w:pPr>
-        <w:spacing w:line="360" w:lineRule="auto"/>
-        <w:jc w:val="both"/>
-        <w:rPr>
-          <w:rFonts w:ascii="Arial" w:hAnsi="Arial" w:cs="Arial"/>
-          <w:b/>
-          <w:bCs/>
-          <w:sz w:val="24"/>
-          <w:szCs w:val="24"/>
-        </w:rPr>
-      </w:pPr>
+          <w:sz w:val="24"/>
+          <w:szCs w:val="24"/>
+        </w:rPr>
+      </w:pPr>
+      <w:r>
+        <w:rPr>
+          <w:rFonts w:ascii="Arial" w:hAnsi="Arial" w:cs="Arial"/>
+          <w:sz w:val="24"/>
+          <w:szCs w:val="24"/>
+        </w:rPr>
+        <w:t>En esta carpeta de backend, encontramos lo siguiente:</w:t>
+      </w:r>
+    </w:p>
+    <w:p>
+      <w:pPr>
+        <w:pStyle w:val="Prrafodelista"/>
+        <w:numPr>
+          <w:ilvl w:val="0"/>
+          <w:numId w:val="10"/>
+        </w:numPr>
+        <w:spacing w:line="360" w:lineRule="auto"/>
+        <w:jc w:val="both"/>
+        <w:rPr>
+          <w:rFonts w:ascii="Arial" w:hAnsi="Arial" w:cs="Arial"/>
+          <w:sz w:val="24"/>
+          <w:szCs w:val="24"/>
+        </w:rPr>
+      </w:pPr>
+      <w:r>
+        <w:rPr>
+          <w:rFonts w:ascii="Arial" w:hAnsi="Arial" w:cs="Arial"/>
+          <w:b/>
+          <w:bCs/>
+          <w:sz w:val="24"/>
+          <w:szCs w:val="24"/>
+        </w:rPr>
+        <w:t>Config:</w:t>
+      </w:r>
+      <w:r>
+        <w:rPr>
+          <w:rFonts w:ascii="Arial" w:hAnsi="Arial" w:cs="Arial"/>
+          <w:sz w:val="24"/>
+          <w:szCs w:val="24"/>
+        </w:rPr>
+        <w:t xml:space="preserve"> </w:t>
+      </w:r>
+      <w:r>
+        <w:rPr>
+          <w:rFonts w:ascii="Arial" w:hAnsi="Arial" w:cs="Arial"/>
+          <w:sz w:val="24"/>
+          <w:szCs w:val="24"/>
+          <w:u w:val="single"/>
+        </w:rPr>
+        <w:t>contiene la configuración general del proyecto</w:t>
+      </w:r>
+      <w:r>
+        <w:rPr>
+          <w:rFonts w:ascii="Arial" w:hAnsi="Arial" w:cs="Arial"/>
+          <w:sz w:val="24"/>
+          <w:szCs w:val="24"/>
+        </w:rPr>
+        <w:t>, tanto como las conexiones de bases de datos, puertos y variables de entorno.</w:t>
+      </w:r>
+    </w:p>
+    <w:p>
+      <w:pPr>
+        <w:pStyle w:val="Prrafodelista"/>
+        <w:numPr>
+          <w:ilvl w:val="0"/>
+          <w:numId w:val="10"/>
+        </w:numPr>
+        <w:spacing w:line="360" w:lineRule="auto"/>
+        <w:jc w:val="both"/>
+        <w:rPr>
+          <w:rFonts w:ascii="Arial" w:hAnsi="Arial" w:cs="Arial"/>
+          <w:sz w:val="24"/>
+          <w:szCs w:val="24"/>
+        </w:rPr>
+      </w:pPr>
+      <w:proofErr w:type="spellStart"/>
+      <w:r>
+        <w:rPr>
+          <w:rFonts w:ascii="Arial" w:hAnsi="Arial" w:cs="Arial"/>
+          <w:b/>
+          <w:bCs/>
+          <w:sz w:val="24"/>
+          <w:szCs w:val="24"/>
+        </w:rPr>
+        <w:t>Controllers</w:t>
+      </w:r>
+      <w:proofErr w:type="spellEnd"/>
+      <w:r>
+        <w:rPr>
+          <w:rFonts w:ascii="Arial" w:hAnsi="Arial" w:cs="Arial"/>
+          <w:b/>
+          <w:bCs/>
+          <w:sz w:val="24"/>
+          <w:szCs w:val="24"/>
+        </w:rPr>
+        <w:t>:</w:t>
+      </w:r>
+      <w:r>
+        <w:rPr>
+          <w:rFonts w:ascii="Arial" w:hAnsi="Arial" w:cs="Arial"/>
+          <w:sz w:val="24"/>
+          <w:szCs w:val="24"/>
+        </w:rPr>
+        <w:t xml:space="preserve"> </w:t>
+      </w:r>
+      <w:r>
+        <w:rPr>
+          <w:rFonts w:ascii="Arial" w:hAnsi="Arial" w:cs="Arial"/>
+          <w:sz w:val="24"/>
+          <w:szCs w:val="24"/>
+          <w:u w:val="single"/>
+        </w:rPr>
+        <w:t>intermediario entre la lógica del sistema y cliente</w:t>
+      </w:r>
+      <w:r>
+        <w:rPr>
+          <w:rFonts w:ascii="Arial" w:hAnsi="Arial" w:cs="Arial"/>
+          <w:sz w:val="24"/>
+          <w:szCs w:val="24"/>
+        </w:rPr>
+        <w:t>, recibe las peticiones HTTPS, y las funciones para trabajar.</w:t>
+      </w:r>
+    </w:p>
+    <w:p>
+      <w:pPr>
+        <w:pStyle w:val="Prrafodelista"/>
+        <w:numPr>
+          <w:ilvl w:val="0"/>
+          <w:numId w:val="10"/>
+        </w:numPr>
+        <w:spacing w:line="360" w:lineRule="auto"/>
+        <w:jc w:val="both"/>
+        <w:rPr>
+          <w:rFonts w:ascii="Arial" w:hAnsi="Arial" w:cs="Arial"/>
+          <w:sz w:val="24"/>
+          <w:szCs w:val="24"/>
+        </w:rPr>
+      </w:pPr>
+      <w:r>
+        <w:rPr>
+          <w:rFonts w:ascii="Arial" w:hAnsi="Arial" w:cs="Arial"/>
+          <w:b/>
+          <w:bCs/>
+          <w:sz w:val="24"/>
+          <w:szCs w:val="24"/>
+        </w:rPr>
+        <w:t xml:space="preserve">Middleware: </w:t>
+      </w:r>
+      <w:r>
+        <w:rPr>
+          <w:rFonts w:ascii="Arial" w:hAnsi="Arial" w:cs="Arial"/>
+          <w:sz w:val="24"/>
+          <w:szCs w:val="24"/>
+          <w:u w:val="single"/>
+        </w:rPr>
+        <w:t xml:space="preserve">ejecuta procesos antes de llegar o después de llegar al </w:t>
+      </w:r>
+      <w:proofErr w:type="spellStart"/>
+      <w:r>
+        <w:rPr>
+          <w:rFonts w:ascii="Arial" w:hAnsi="Arial" w:cs="Arial"/>
+          <w:sz w:val="24"/>
+          <w:szCs w:val="24"/>
+          <w:u w:val="single"/>
+        </w:rPr>
+        <w:t>controller</w:t>
+      </w:r>
+      <w:proofErr w:type="spellEnd"/>
+      <w:r>
+        <w:rPr>
+          <w:rFonts w:ascii="Arial" w:hAnsi="Arial" w:cs="Arial"/>
+          <w:sz w:val="24"/>
+          <w:szCs w:val="24"/>
+        </w:rPr>
+        <w:t>. Como autenticaciones, logs, verificación de roles, errores.</w:t>
+      </w:r>
+    </w:p>
+    <w:p>
+      <w:pPr>
+        <w:pStyle w:val="Prrafodelista"/>
+        <w:numPr>
+          <w:ilvl w:val="0"/>
+          <w:numId w:val="10"/>
+        </w:numPr>
+        <w:spacing w:line="360" w:lineRule="auto"/>
+        <w:jc w:val="both"/>
+        <w:rPr>
+          <w:rFonts w:ascii="Arial" w:hAnsi="Arial" w:cs="Arial"/>
+          <w:sz w:val="24"/>
+          <w:szCs w:val="24"/>
+        </w:rPr>
+      </w:pPr>
+      <w:proofErr w:type="spellStart"/>
+      <w:r>
+        <w:rPr>
+          <w:rFonts w:ascii="Arial" w:hAnsi="Arial" w:cs="Arial"/>
+          <w:b/>
+          <w:bCs/>
+          <w:sz w:val="24"/>
+          <w:szCs w:val="24"/>
+        </w:rPr>
+        <w:t>Models</w:t>
+      </w:r>
+      <w:proofErr w:type="spellEnd"/>
+      <w:r>
+        <w:rPr>
+          <w:rFonts w:ascii="Arial" w:hAnsi="Arial" w:cs="Arial"/>
+          <w:sz w:val="24"/>
+          <w:szCs w:val="24"/>
+        </w:rPr>
+        <w:t>:</w:t>
+      </w:r>
+      <w:r>
+        <w:rPr>
+          <w:rFonts w:ascii="Arial" w:hAnsi="Arial" w:cs="Arial"/>
+          <w:sz w:val="24"/>
+          <w:szCs w:val="24"/>
+        </w:rPr>
+        <w:t xml:space="preserve"> </w:t>
+      </w:r>
+      <w:r>
+        <w:rPr>
+          <w:rFonts w:ascii="Arial" w:hAnsi="Arial" w:cs="Arial"/>
+          <w:sz w:val="24"/>
+          <w:szCs w:val="24"/>
+          <w:u w:val="single"/>
+        </w:rPr>
+        <w:t>representa los datos y las tablas de las bases de datos</w:t>
+      </w:r>
+      <w:r>
+        <w:rPr>
+          <w:rFonts w:ascii="Arial" w:hAnsi="Arial" w:cs="Arial"/>
+          <w:sz w:val="24"/>
+          <w:szCs w:val="24"/>
+        </w:rPr>
+        <w:t>, como su tipo de dato, atributos, restricciones.</w:t>
+      </w:r>
+    </w:p>
+    <w:p>
+      <w:pPr>
+        <w:pStyle w:val="Prrafodelista"/>
+        <w:numPr>
+          <w:ilvl w:val="0"/>
+          <w:numId w:val="10"/>
+        </w:numPr>
+        <w:spacing w:line="360" w:lineRule="auto"/>
+        <w:jc w:val="both"/>
+        <w:rPr>
+          <w:rFonts w:ascii="Arial" w:hAnsi="Arial" w:cs="Arial"/>
+          <w:sz w:val="24"/>
+          <w:szCs w:val="24"/>
+        </w:rPr>
+      </w:pPr>
+      <w:proofErr w:type="spellStart"/>
+      <w:r>
+        <w:rPr>
+          <w:rFonts w:ascii="Arial" w:hAnsi="Arial" w:cs="Arial"/>
+          <w:b/>
+          <w:bCs/>
+          <w:sz w:val="24"/>
+          <w:szCs w:val="24"/>
+        </w:rPr>
+        <w:t>Routes</w:t>
+      </w:r>
+      <w:proofErr w:type="spellEnd"/>
+      <w:r>
+        <w:rPr>
+          <w:rFonts w:ascii="Arial" w:hAnsi="Arial" w:cs="Arial"/>
+          <w:sz w:val="24"/>
+          <w:szCs w:val="24"/>
+        </w:rPr>
+        <w:t>:</w:t>
+      </w:r>
+      <w:r>
+        <w:rPr>
+          <w:rFonts w:ascii="Arial" w:hAnsi="Arial" w:cs="Arial"/>
+          <w:sz w:val="24"/>
+          <w:szCs w:val="24"/>
+        </w:rPr>
+        <w:t xml:space="preserve"> </w:t>
+      </w:r>
+      <w:r>
+        <w:rPr>
+          <w:rFonts w:ascii="Arial" w:hAnsi="Arial" w:cs="Arial"/>
+          <w:sz w:val="24"/>
+          <w:szCs w:val="24"/>
+          <w:u w:val="single"/>
+        </w:rPr>
+        <w:t xml:space="preserve">define URL o </w:t>
+      </w:r>
+      <w:proofErr w:type="spellStart"/>
+      <w:r>
+        <w:rPr>
+          <w:rFonts w:ascii="Arial" w:hAnsi="Arial" w:cs="Arial"/>
+          <w:sz w:val="24"/>
+          <w:szCs w:val="24"/>
+          <w:u w:val="single"/>
+        </w:rPr>
+        <w:t>endpoints</w:t>
+      </w:r>
+      <w:proofErr w:type="spellEnd"/>
+      <w:r>
+        <w:rPr>
+          <w:rFonts w:ascii="Arial" w:hAnsi="Arial" w:cs="Arial"/>
+          <w:sz w:val="24"/>
+          <w:szCs w:val="24"/>
+          <w:u w:val="single"/>
+        </w:rPr>
+        <w:t xml:space="preserve"> del sistema.</w:t>
+      </w:r>
+      <w:r>
+        <w:rPr>
+          <w:rFonts w:ascii="Arial" w:hAnsi="Arial" w:cs="Arial"/>
+          <w:sz w:val="24"/>
+          <w:szCs w:val="24"/>
+        </w:rPr>
+        <w:t xml:space="preserve"> Como los </w:t>
+      </w:r>
+      <w:proofErr w:type="spellStart"/>
+      <w:r>
+        <w:rPr>
+          <w:rFonts w:ascii="Arial" w:hAnsi="Arial" w:cs="Arial"/>
+          <w:sz w:val="24"/>
+          <w:szCs w:val="24"/>
+        </w:rPr>
+        <w:t>get</w:t>
+      </w:r>
+      <w:proofErr w:type="spellEnd"/>
+      <w:r>
+        <w:rPr>
+          <w:rFonts w:ascii="Arial" w:hAnsi="Arial" w:cs="Arial"/>
+          <w:sz w:val="24"/>
+          <w:szCs w:val="24"/>
+        </w:rPr>
+        <w:t xml:space="preserve"> de usuarios y post de formularios.</w:t>
+      </w:r>
+    </w:p>
+    <w:p>
+      <w:pPr>
+        <w:pStyle w:val="Prrafodelista"/>
+        <w:numPr>
+          <w:ilvl w:val="0"/>
+          <w:numId w:val="10"/>
+        </w:numPr>
+        <w:spacing w:line="360" w:lineRule="auto"/>
+        <w:jc w:val="both"/>
+        <w:rPr>
+          <w:rFonts w:ascii="Arial" w:hAnsi="Arial" w:cs="Arial"/>
+          <w:sz w:val="24"/>
+          <w:szCs w:val="24"/>
+        </w:rPr>
+      </w:pPr>
+      <w:proofErr w:type="spellStart"/>
+      <w:r>
+        <w:rPr>
+          <w:rFonts w:ascii="Arial" w:hAnsi="Arial" w:cs="Arial"/>
+          <w:b/>
+          <w:bCs/>
+          <w:sz w:val="24"/>
+          <w:szCs w:val="24"/>
+        </w:rPr>
+        <w:t>Services</w:t>
+      </w:r>
+      <w:proofErr w:type="spellEnd"/>
+      <w:r>
+        <w:rPr>
+          <w:rFonts w:ascii="Arial" w:hAnsi="Arial" w:cs="Arial"/>
+          <w:sz w:val="24"/>
+          <w:szCs w:val="24"/>
+        </w:rPr>
+        <w:t xml:space="preserve">: </w:t>
+      </w:r>
+      <w:r>
+        <w:rPr>
+          <w:rFonts w:ascii="Arial" w:hAnsi="Arial" w:cs="Arial"/>
+          <w:sz w:val="24"/>
+          <w:szCs w:val="24"/>
+          <w:u w:val="single"/>
+        </w:rPr>
+        <w:t xml:space="preserve">contiene la lógica del negocio. </w:t>
+      </w:r>
+      <w:r>
+        <w:rPr>
+          <w:rFonts w:ascii="Arial" w:hAnsi="Arial" w:cs="Arial"/>
+          <w:sz w:val="24"/>
+          <w:szCs w:val="24"/>
+        </w:rPr>
+        <w:t>Reglas del sistema, procesos que usan varios modelos, cálculos, validaciones complejas.</w:t>
+      </w:r>
+    </w:p>
+    <w:p>
+      <w:pPr>
+        <w:spacing w:line="360" w:lineRule="auto"/>
+        <w:jc w:val="both"/>
+        <w:rPr>
+          <w:rFonts w:ascii="Arial" w:hAnsi="Arial" w:cs="Arial"/>
+          <w:sz w:val="24"/>
+          <w:szCs w:val="24"/>
+        </w:rPr>
+      </w:pPr>
+    </w:p>
+    <w:p>
+      <w:pPr>
+        <w:spacing w:line="360" w:lineRule="auto"/>
+        <w:jc w:val="both"/>
+        <w:rPr>
+          <w:rFonts w:ascii="Arial" w:hAnsi="Arial" w:cs="Arial"/>
+          <w:sz w:val="24"/>
+          <w:szCs w:val="24"/>
+        </w:rPr>
+      </w:pPr>
+    </w:p>
+    <w:p>
+      <w:pPr>
+        <w:spacing w:line="360" w:lineRule="auto"/>
+        <w:jc w:val="both"/>
+        <w:rPr>
+          <w:rFonts w:ascii="Arial" w:hAnsi="Arial" w:cs="Arial"/>
+          <w:sz w:val="24"/>
+          <w:szCs w:val="24"/>
+        </w:rPr>
+      </w:pPr>
+    </w:p>
+    <w:p>
+      <w:pPr>
+        <w:spacing w:line="360" w:lineRule="auto"/>
+        <w:jc w:val="both"/>
+        <w:rPr>
+          <w:rFonts w:ascii="Arial" w:hAnsi="Arial" w:cs="Arial"/>
+          <w:b/>
+          <w:bCs/>
+          <w:sz w:val="24"/>
+          <w:szCs w:val="24"/>
+        </w:rPr>
+      </w:pPr>
+      <w:r>
+        <w:rPr>
+          <w:rFonts w:ascii="Arial" w:hAnsi="Arial" w:cs="Arial"/>
+          <w:b/>
+          <w:bCs/>
+          <w:sz w:val="24"/>
+          <w:szCs w:val="24"/>
+        </w:rPr>
+        <w:t>5. ESTRUCTURA DE LA CARPETA FRONTEND:</w:t>
+      </w:r>
+    </w:p>
+    <w:p>
+      <w:pPr>
+        <w:spacing w:line="360" w:lineRule="auto"/>
+        <w:jc w:val="both"/>
+        <w:rPr>
+          <w:rFonts w:ascii="Arial" w:hAnsi="Arial" w:cs="Arial"/>
+          <w:b/>
+          <w:bCs/>
+          <w:sz w:val="24"/>
+          <w:szCs w:val="24"/>
+        </w:rPr>
+      </w:pPr>
+      <w:r>
+        <w:rPr>
+          <w:rFonts w:ascii="Arial" w:hAnsi="Arial" w:cs="Arial"/>
+          <w:b/>
+          <w:bCs/>
+          <w:sz w:val="24"/>
+          <w:szCs w:val="24"/>
+        </w:rPr>
+        <w:drawing>
+          <wp:anchor distT="0" distB="0" distL="114300" distR="114300" simplePos="0" relativeHeight="251662336" behindDoc="1" locked="0" layoutInCell="1" allowOverlap="1" wp14:anchorId="56B7E914" wp14:editId="7D2215E3">
+            <wp:simplePos x="0" y="0"/>
+            <wp:positionH relativeFrom="margin">
+              <wp:align>center</wp:align>
+            </wp:positionH>
+            <wp:positionV relativeFrom="paragraph">
+              <wp:posOffset>79375</wp:posOffset>
+            </wp:positionV>
+            <wp:extent cx="4696480" cy="2486372"/>
+            <wp:effectExtent l="133350" t="76200" r="85090" b="142875"/>
+            <wp:wrapTight wrapText="bothSides">
+              <wp:wrapPolygon edited="0">
+                <wp:start x="1577" y="-662"/>
+                <wp:lineTo x="-438" y="-331"/>
+                <wp:lineTo x="-613" y="10262"/>
+                <wp:lineTo x="-613" y="20855"/>
+                <wp:lineTo x="-88" y="21186"/>
+                <wp:lineTo x="1139" y="22676"/>
+                <wp:lineTo x="20151" y="22676"/>
+                <wp:lineTo x="20239" y="22345"/>
+                <wp:lineTo x="21466" y="21021"/>
+                <wp:lineTo x="21466" y="20855"/>
+                <wp:lineTo x="21904" y="18372"/>
+                <wp:lineTo x="21904" y="4966"/>
+                <wp:lineTo x="21729" y="1655"/>
+                <wp:lineTo x="20239" y="-331"/>
+                <wp:lineTo x="19713" y="-662"/>
+                <wp:lineTo x="1577" y="-662"/>
+              </wp:wrapPolygon>
+            </wp:wrapTight>
+            <wp:docPr id="6" name="Imagen 6" descr="Interfaz de usuario gráfica, Aplicación&#10;&#10;Descripción generada automáticamente"/>
+            <wp:cNvGraphicFramePr>
+              <a:graphicFrameLocks xmlns:a="http://schemas.openxmlformats.org/drawingml/2006/main" noChangeAspect="1"/>
+            </wp:cNvGraphicFramePr>
+            <a:graphic xmlns:a="http://schemas.openxmlformats.org/drawingml/2006/main">
+              <a:graphicData uri="http://schemas.openxmlformats.org/drawingml/2006/picture">
+                <pic:pic xmlns:pic="http://schemas.openxmlformats.org/drawingml/2006/picture">
+                  <pic:nvPicPr>
+                    <pic:cNvPr id="1" name=""/>
+                    <pic:cNvPicPr/>
+                  </pic:nvPicPr>
+                  <pic:blipFill>
+                    <a:blip r:embed="rId11">
+                      <a:extLst>
+                        <a:ext uri="{28A0092B-C50C-407E-A947-70E740481C1C}">
+                          <a14:useLocalDpi xmlns:a14="http://schemas.microsoft.com/office/drawing/2010/main" val="0"/>
+                        </a:ext>
+                      </a:extLst>
+                    </a:blip>
+                    <a:stretch>
+                      <a:fillRect/>
+                    </a:stretch>
+                  </pic:blipFill>
+                  <pic:spPr>
+                    <a:xfrm>
+                      <a:off x="0" y="0"/>
+                      <a:ext cx="4696480" cy="2486372"/>
+                    </a:xfrm>
+                    <a:prstGeom prst="roundRect">
+                      <a:avLst>
+                        <a:gd name="adj" fmla="val 16667"/>
+                      </a:avLst>
+                    </a:prstGeom>
+                    <a:ln>
+                      <a:noFill/>
+                    </a:ln>
+                    <a:effectLst>
+                      <a:outerShdw blurRad="76200" dist="38100" dir="7800000" algn="tl" rotWithShape="0">
+                        <a:srgbClr val="000000">
+                          <a:alpha val="40000"/>
+                        </a:srgbClr>
+                      </a:outerShdw>
+                    </a:effectLst>
+                    <a:scene3d>
+                      <a:camera prst="orthographicFront"/>
+                      <a:lightRig rig="contrasting" dir="t">
+                        <a:rot lat="0" lon="0" rev="4200000"/>
+                      </a:lightRig>
+                    </a:scene3d>
+                    <a:sp3d prstMaterial="plastic">
+                      <a:bevelT w="381000" h="114300" prst="relaxedInset"/>
+                      <a:contourClr>
+                        <a:srgbClr val="969696"/>
+                      </a:contourClr>
+                    </a:sp3d>
+                  </pic:spPr>
+                </pic:pic>
+              </a:graphicData>
+            </a:graphic>
+          </wp:anchor>
+        </w:drawing>
+      </w:r>
+    </w:p>
+    <w:p>
+      <w:pPr>
+        <w:spacing w:line="360" w:lineRule="auto"/>
+        <w:jc w:val="both"/>
+        <w:rPr>
+          <w:rFonts w:ascii="Arial" w:hAnsi="Arial" w:cs="Arial"/>
+          <w:b/>
+          <w:bCs/>
+          <w:sz w:val="24"/>
+          <w:szCs w:val="24"/>
+        </w:rPr>
+      </w:pPr>
+    </w:p>
+    <w:p>
+      <w:pPr>
+        <w:spacing w:line="360" w:lineRule="auto"/>
+        <w:jc w:val="both"/>
+        <w:rPr>
+          <w:rFonts w:ascii="Arial" w:hAnsi="Arial" w:cs="Arial"/>
+          <w:b/>
+          <w:bCs/>
+          <w:sz w:val="24"/>
+          <w:szCs w:val="24"/>
+        </w:rPr>
+      </w:pPr>
+    </w:p>
+    <w:p>
+      <w:pPr>
+        <w:spacing w:line="360" w:lineRule="auto"/>
+        <w:jc w:val="both"/>
+        <w:rPr>
+          <w:rFonts w:ascii="Arial" w:hAnsi="Arial" w:cs="Arial"/>
+          <w:b/>
+          <w:bCs/>
+          <w:sz w:val="24"/>
+          <w:szCs w:val="24"/>
+        </w:rPr>
+      </w:pPr>
+    </w:p>
+    <w:p>
+      <w:pPr>
+        <w:spacing w:line="360" w:lineRule="auto"/>
+        <w:jc w:val="both"/>
+        <w:rPr>
+          <w:rFonts w:ascii="Arial" w:hAnsi="Arial" w:cs="Arial"/>
+          <w:b/>
+          <w:bCs/>
+          <w:sz w:val="24"/>
+          <w:szCs w:val="24"/>
+        </w:rPr>
+      </w:pPr>
+    </w:p>
+    <w:p>
+      <w:pPr>
+        <w:spacing w:line="360" w:lineRule="auto"/>
+        <w:jc w:val="both"/>
+        <w:rPr>
+          <w:rFonts w:ascii="Arial" w:hAnsi="Arial" w:cs="Arial"/>
+          <w:b/>
+          <w:bCs/>
+          <w:sz w:val="24"/>
+          <w:szCs w:val="24"/>
+        </w:rPr>
+      </w:pPr>
+    </w:p>
+    <w:p>
+      <w:pPr>
+        <w:spacing w:line="360" w:lineRule="auto"/>
+        <w:jc w:val="both"/>
+        <w:rPr>
+          <w:rFonts w:ascii="Arial" w:hAnsi="Arial" w:cs="Arial"/>
+          <w:b/>
+          <w:bCs/>
+          <w:sz w:val="24"/>
+          <w:szCs w:val="24"/>
+        </w:rPr>
+      </w:pPr>
+    </w:p>
+    <w:p>
+      <w:pPr>
+        <w:spacing w:line="360" w:lineRule="auto"/>
+        <w:jc w:val="both"/>
+        <w:rPr>
+          <w:rFonts w:ascii="Arial" w:hAnsi="Arial" w:cs="Arial"/>
+          <w:b/>
+          <w:bCs/>
+          <w:sz w:val="24"/>
+          <w:szCs w:val="24"/>
+        </w:rPr>
+      </w:pPr>
+    </w:p>
+    <w:p>
+      <w:pPr>
+        <w:spacing w:line="360" w:lineRule="auto"/>
+        <w:jc w:val="both"/>
+        <w:rPr>
+          <w:rFonts w:ascii="Arial" w:hAnsi="Arial" w:cs="Arial"/>
+          <w:b/>
+          <w:bCs/>
+          <w:sz w:val="24"/>
+          <w:szCs w:val="24"/>
+        </w:rPr>
+      </w:pPr>
+    </w:p>
+    <w:p>
+      <w:pPr>
+        <w:spacing w:line="360" w:lineRule="auto"/>
+        <w:jc w:val="both"/>
+        <w:rPr>
+          <w:rFonts w:ascii="Arial" w:hAnsi="Arial" w:cs="Arial"/>
+          <w:b/>
+          <w:bCs/>
+          <w:sz w:val="24"/>
+          <w:szCs w:val="24"/>
+        </w:rPr>
+      </w:pPr>
+    </w:p>
+    <w:p>
+      <w:pPr>
+        <w:spacing w:line="360" w:lineRule="auto"/>
+        <w:jc w:val="both"/>
+        <w:rPr>
+          <w:rFonts w:ascii="Arial" w:hAnsi="Arial" w:cs="Arial"/>
+          <w:sz w:val="24"/>
+          <w:szCs w:val="24"/>
+        </w:rPr>
+      </w:pPr>
+    </w:p>
+    <w:p>
+      <w:pPr>
+        <w:spacing w:line="360" w:lineRule="auto"/>
+        <w:jc w:val="both"/>
+        <w:rPr>
+          <w:rFonts w:ascii="Arial" w:hAnsi="Arial" w:cs="Arial"/>
+          <w:sz w:val="24"/>
+          <w:szCs w:val="24"/>
+        </w:rPr>
+      </w:pPr>
+      <w:r>
+        <w:rPr>
+          <w:rFonts w:ascii="Arial" w:hAnsi="Arial" w:cs="Arial"/>
+          <w:sz w:val="24"/>
+          <w:szCs w:val="24"/>
+        </w:rPr>
+        <w:t>En esta carpeta de backend, encontramos lo siguiente:</w:t>
+      </w:r>
+    </w:p>
+    <w:p>
+      <w:pPr>
+        <w:pStyle w:val="Prrafodelista"/>
+        <w:numPr>
+          <w:ilvl w:val="0"/>
+          <w:numId w:val="11"/>
+        </w:numPr>
+        <w:spacing w:line="360" w:lineRule="auto"/>
+        <w:jc w:val="both"/>
+        <w:rPr>
+          <w:rFonts w:ascii="Arial" w:hAnsi="Arial" w:cs="Arial"/>
+          <w:b/>
+          <w:bCs/>
+          <w:sz w:val="24"/>
+          <w:szCs w:val="24"/>
+        </w:rPr>
+      </w:pPr>
+      <w:proofErr w:type="spellStart"/>
+      <w:r>
+        <w:rPr>
+          <w:rFonts w:ascii="Arial" w:hAnsi="Arial" w:cs="Arial"/>
+          <w:b/>
+          <w:bCs/>
+          <w:sz w:val="24"/>
+          <w:szCs w:val="24"/>
+        </w:rPr>
+        <w:t>Assets</w:t>
+      </w:r>
+      <w:proofErr w:type="spellEnd"/>
+      <w:r>
+        <w:rPr>
+          <w:rFonts w:ascii="Arial" w:hAnsi="Arial" w:cs="Arial"/>
+          <w:b/>
+          <w:bCs/>
+          <w:sz w:val="24"/>
+          <w:szCs w:val="24"/>
+        </w:rPr>
+        <w:t xml:space="preserve">: </w:t>
+      </w:r>
+      <w:r>
+        <w:rPr>
+          <w:rFonts w:ascii="Arial" w:hAnsi="Arial" w:cs="Arial"/>
+          <w:sz w:val="24"/>
+          <w:szCs w:val="24"/>
+        </w:rPr>
+        <w:t>en esta carpeta se encontrarán recursos estáticos que se pueden acceder para usar en la interfaz.</w:t>
+      </w:r>
+    </w:p>
+    <w:p>
+      <w:pPr>
+        <w:spacing w:line="360" w:lineRule="auto"/>
+        <w:jc w:val="both"/>
+        <w:rPr>
+          <w:rFonts w:ascii="Arial" w:hAnsi="Arial" w:cs="Arial"/>
+          <w:b/>
+          <w:bCs/>
+          <w:sz w:val="24"/>
+          <w:szCs w:val="24"/>
+        </w:rPr>
+      </w:pPr>
+      <w:r>
+        <w:rPr>
+          <w:rFonts w:ascii="Arial" w:hAnsi="Arial" w:cs="Arial"/>
+          <w:b/>
+          <w:bCs/>
+          <w:sz w:val="24"/>
+          <w:szCs w:val="24"/>
+        </w:rPr>
+        <w:drawing>
+          <wp:anchor distT="0" distB="0" distL="114300" distR="114300" simplePos="0" relativeHeight="251663360" behindDoc="1" locked="0" layoutInCell="1" allowOverlap="1" wp14:anchorId="0DC2126D" wp14:editId="1A288D00">
+            <wp:simplePos x="0" y="0"/>
+            <wp:positionH relativeFrom="column">
+              <wp:posOffset>-451485</wp:posOffset>
+            </wp:positionH>
+            <wp:positionV relativeFrom="paragraph">
+              <wp:posOffset>76240</wp:posOffset>
+            </wp:positionV>
+            <wp:extent cx="2793411" cy="2407920"/>
+            <wp:effectExtent l="133350" t="76200" r="83185" b="125730"/>
+            <wp:wrapTight wrapText="bothSides">
+              <wp:wrapPolygon edited="0">
+                <wp:start x="2062" y="-684"/>
+                <wp:lineTo x="-884" y="-342"/>
+                <wp:lineTo x="-1031" y="20506"/>
+                <wp:lineTo x="442" y="21532"/>
+                <wp:lineTo x="1768" y="22215"/>
+                <wp:lineTo x="1915" y="22557"/>
+                <wp:lineTo x="19150" y="22557"/>
+                <wp:lineTo x="19297" y="22215"/>
+                <wp:lineTo x="20623" y="21532"/>
+                <wp:lineTo x="20770" y="21532"/>
+                <wp:lineTo x="22096" y="18968"/>
+                <wp:lineTo x="21949" y="2051"/>
+                <wp:lineTo x="19444" y="-342"/>
+                <wp:lineTo x="19003" y="-684"/>
+                <wp:lineTo x="2062" y="-684"/>
+              </wp:wrapPolygon>
+            </wp:wrapTight>
+            <wp:docPr id="7" name="Imagen 7"/>
+            <wp:cNvGraphicFramePr>
+              <a:graphicFrameLocks xmlns:a="http://schemas.openxmlformats.org/drawingml/2006/main" noChangeAspect="1"/>
+            </wp:cNvGraphicFramePr>
+            <a:graphic xmlns:a="http://schemas.openxmlformats.org/drawingml/2006/main">
+              <a:graphicData uri="http://schemas.openxmlformats.org/drawingml/2006/picture">
+                <pic:pic xmlns:pic="http://schemas.openxmlformats.org/drawingml/2006/picture">
+                  <pic:nvPicPr>
+                    <pic:cNvPr id="1" name=""/>
+                    <pic:cNvPicPr/>
+                  </pic:nvPicPr>
+                  <pic:blipFill>
+                    <a:blip r:embed="rId12">
+                      <a:extLst>
+                        <a:ext uri="{28A0092B-C50C-407E-A947-70E740481C1C}">
+                          <a14:useLocalDpi xmlns:a14="http://schemas.microsoft.com/office/drawing/2010/main" val="0"/>
+                        </a:ext>
+                      </a:extLst>
+                    </a:blip>
+                    <a:stretch>
+                      <a:fillRect/>
+                    </a:stretch>
+                  </pic:blipFill>
+                  <pic:spPr>
+                    <a:xfrm>
+                      <a:off x="0" y="0"/>
+                      <a:ext cx="2793411" cy="2407920"/>
+                    </a:xfrm>
+                    <a:prstGeom prst="roundRect">
+                      <a:avLst>
+                        <a:gd name="adj" fmla="val 16667"/>
+                      </a:avLst>
+                    </a:prstGeom>
+                    <a:ln>
+                      <a:noFill/>
+                    </a:ln>
+                    <a:effectLst>
+                      <a:outerShdw blurRad="76200" dist="38100" dir="7800000" algn="tl" rotWithShape="0">
+                        <a:srgbClr val="000000">
+                          <a:alpha val="40000"/>
+                        </a:srgbClr>
+                      </a:outerShdw>
+                    </a:effectLst>
+                    <a:scene3d>
+                      <a:camera prst="orthographicFront"/>
+                      <a:lightRig rig="contrasting" dir="t">
+                        <a:rot lat="0" lon="0" rev="4200000"/>
+                      </a:lightRig>
+                    </a:scene3d>
+                    <a:sp3d prstMaterial="plastic">
+                      <a:bevelT w="381000" h="114300" prst="relaxedInset"/>
+                      <a:contourClr>
+                        <a:srgbClr val="969696"/>
+                      </a:contourClr>
+                    </a:sp3d>
+                  </pic:spPr>
+                </pic:pic>
+              </a:graphicData>
+            </a:graphic>
+          </wp:anchor>
+        </w:drawing>
+      </w:r>
+    </w:p>
+    <w:p>
+      <w:pPr>
+        <w:spacing w:line="360" w:lineRule="auto"/>
+        <w:jc w:val="both"/>
+        <w:rPr>
+          <w:rFonts w:ascii="Arial" w:hAnsi="Arial" w:cs="Arial"/>
+          <w:sz w:val="24"/>
+          <w:szCs w:val="24"/>
+        </w:rPr>
+      </w:pPr>
+      <w:r>
+        <w:rPr>
+          <w:rFonts w:ascii="Arial" w:hAnsi="Arial" w:cs="Arial"/>
+          <w:sz w:val="24"/>
+          <w:szCs w:val="24"/>
+        </w:rPr>
+        <w:t xml:space="preserve">Dentro de </w:t>
+      </w:r>
+      <w:proofErr w:type="spellStart"/>
+      <w:r>
+        <w:rPr>
+          <w:rFonts w:ascii="Arial" w:hAnsi="Arial" w:cs="Arial"/>
+          <w:sz w:val="24"/>
+          <w:szCs w:val="24"/>
+        </w:rPr>
+        <w:t>asstes</w:t>
+      </w:r>
+      <w:proofErr w:type="spellEnd"/>
+      <w:r>
+        <w:rPr>
+          <w:rFonts w:ascii="Arial" w:hAnsi="Arial" w:cs="Arial"/>
+          <w:sz w:val="24"/>
+          <w:szCs w:val="24"/>
+        </w:rPr>
+        <w:t xml:space="preserve"> tendremos las:</w:t>
+      </w:r>
+    </w:p>
+    <w:p>
+      <w:pPr>
+        <w:pStyle w:val="Prrafodelista"/>
+        <w:numPr>
+          <w:ilvl w:val="0"/>
+          <w:numId w:val="12"/>
+        </w:numPr>
+        <w:spacing w:line="360" w:lineRule="auto"/>
+        <w:jc w:val="both"/>
+        <w:rPr>
+          <w:rFonts w:ascii="Arial" w:hAnsi="Arial" w:cs="Arial"/>
+          <w:sz w:val="24"/>
+          <w:szCs w:val="24"/>
+        </w:rPr>
+      </w:pPr>
+      <w:r>
+        <w:rPr>
+          <w:rFonts w:ascii="Arial" w:hAnsi="Arial" w:cs="Arial"/>
+          <w:sz w:val="24"/>
+          <w:szCs w:val="24"/>
+        </w:rPr>
+        <w:t>Fuentes.</w:t>
+      </w:r>
+    </w:p>
+    <w:p>
+      <w:pPr>
+        <w:pStyle w:val="Prrafodelista"/>
+        <w:numPr>
+          <w:ilvl w:val="0"/>
+          <w:numId w:val="12"/>
+        </w:numPr>
+        <w:spacing w:line="360" w:lineRule="auto"/>
+        <w:jc w:val="both"/>
+        <w:rPr>
+          <w:rFonts w:ascii="Arial" w:hAnsi="Arial" w:cs="Arial"/>
+          <w:sz w:val="24"/>
+          <w:szCs w:val="24"/>
+        </w:rPr>
+      </w:pPr>
+      <w:r>
+        <w:rPr>
+          <w:rFonts w:ascii="Arial" w:hAnsi="Arial" w:cs="Arial"/>
+          <w:sz w:val="24"/>
+          <w:szCs w:val="24"/>
+        </w:rPr>
+        <w:t>Iconos.</w:t>
+      </w:r>
+    </w:p>
+    <w:p>
+      <w:pPr>
+        <w:pStyle w:val="Prrafodelista"/>
+        <w:numPr>
+          <w:ilvl w:val="0"/>
+          <w:numId w:val="12"/>
+        </w:numPr>
+        <w:spacing w:line="360" w:lineRule="auto"/>
+        <w:jc w:val="both"/>
+        <w:rPr>
+          <w:rFonts w:ascii="Arial" w:hAnsi="Arial" w:cs="Arial"/>
+          <w:sz w:val="24"/>
+          <w:szCs w:val="24"/>
+        </w:rPr>
+      </w:pPr>
+      <w:r>
+        <w:rPr>
+          <w:rFonts w:ascii="Arial" w:hAnsi="Arial" w:cs="Arial"/>
+          <w:sz w:val="24"/>
+          <w:szCs w:val="24"/>
+        </w:rPr>
+        <w:t>Imágenes.</w:t>
+      </w:r>
+    </w:p>
+    <w:p>
+      <w:pPr>
+        <w:pStyle w:val="Prrafodelista"/>
+        <w:numPr>
+          <w:ilvl w:val="0"/>
+          <w:numId w:val="12"/>
+        </w:numPr>
+        <w:spacing w:line="360" w:lineRule="auto"/>
+        <w:jc w:val="both"/>
+        <w:rPr>
+          <w:rFonts w:ascii="Arial" w:hAnsi="Arial" w:cs="Arial"/>
+          <w:b/>
+          <w:bCs/>
+          <w:color w:val="7030A0"/>
+          <w:sz w:val="24"/>
+          <w:szCs w:val="24"/>
+        </w:rPr>
+      </w:pPr>
+      <w:r>
+        <w:rPr>
+          <w:rFonts w:ascii="Arial" w:hAnsi="Arial" w:cs="Arial"/>
+          <w:b/>
+          <w:bCs/>
+          <w:color w:val="7030A0"/>
+          <w:sz w:val="24"/>
+          <w:szCs w:val="24"/>
+        </w:rPr>
+        <w:t>Vídeos.</w:t>
+      </w:r>
+    </w:p>
+    <w:p>
+      <w:pPr>
+        <w:pStyle w:val="Prrafodelista"/>
+        <w:numPr>
+          <w:ilvl w:val="0"/>
+          <w:numId w:val="12"/>
+        </w:numPr>
+        <w:spacing w:line="360" w:lineRule="auto"/>
+        <w:jc w:val="both"/>
+        <w:rPr>
+          <w:rFonts w:ascii="Arial" w:hAnsi="Arial" w:cs="Arial"/>
+          <w:b/>
+          <w:bCs/>
+          <w:color w:val="7030A0"/>
+          <w:sz w:val="24"/>
+          <w:szCs w:val="24"/>
+        </w:rPr>
+      </w:pPr>
+      <w:r>
+        <w:rPr>
+          <w:rFonts w:ascii="Arial" w:hAnsi="Arial" w:cs="Arial"/>
+          <w:b/>
+          <w:bCs/>
+          <w:color w:val="7030A0"/>
+          <w:sz w:val="24"/>
+          <w:szCs w:val="24"/>
+        </w:rPr>
+        <w:t>Audios.</w:t>
+      </w:r>
+    </w:p>
+    <w:p>
+      <w:pPr>
+        <w:pStyle w:val="Prrafodelista"/>
+        <w:numPr>
+          <w:ilvl w:val="0"/>
+          <w:numId w:val="12"/>
+        </w:numPr>
+        <w:spacing w:line="360" w:lineRule="auto"/>
+        <w:jc w:val="both"/>
+        <w:rPr>
+          <w:rFonts w:ascii="Arial" w:hAnsi="Arial" w:cs="Arial"/>
+          <w:b/>
+          <w:bCs/>
+          <w:color w:val="7030A0"/>
+          <w:sz w:val="24"/>
+          <w:szCs w:val="24"/>
+        </w:rPr>
+      </w:pPr>
+      <w:r>
+        <w:rPr>
+          <w:rFonts w:ascii="Arial" w:hAnsi="Arial" w:cs="Arial"/>
+          <w:b/>
+          <w:bCs/>
+          <w:color w:val="7030A0"/>
+          <w:sz w:val="24"/>
+          <w:szCs w:val="24"/>
+        </w:rPr>
+        <w:t>Logos.</w:t>
+      </w:r>
+    </w:p>
+    <w:p>
+      <w:pPr>
+        <w:pStyle w:val="Prrafodelista"/>
+        <w:spacing w:line="360" w:lineRule="auto"/>
+        <w:jc w:val="both"/>
+        <w:rPr>
+          <w:rFonts w:ascii="Arial" w:hAnsi="Arial" w:cs="Arial"/>
+          <w:sz w:val="24"/>
+          <w:szCs w:val="24"/>
+        </w:rPr>
+      </w:pPr>
+      <w:r>
+        <w:rPr>
+          <w:rFonts w:ascii="Arial" w:hAnsi="Arial" w:cs="Arial"/>
+          <w:sz w:val="24"/>
+          <w:szCs w:val="24"/>
+        </w:rPr>
+        <w:t xml:space="preserve">Las resaltadas en morado, serán anexadas después del </w:t>
+      </w:r>
+      <w:proofErr w:type="spellStart"/>
+      <w:r>
+        <w:rPr>
+          <w:rFonts w:ascii="Arial" w:hAnsi="Arial" w:cs="Arial"/>
+          <w:sz w:val="24"/>
+          <w:szCs w:val="24"/>
+        </w:rPr>
+        <w:t>commit</w:t>
+      </w:r>
+      <w:proofErr w:type="spellEnd"/>
+      <w:r>
+        <w:rPr>
+          <w:rFonts w:ascii="Arial" w:hAnsi="Arial" w:cs="Arial"/>
+          <w:sz w:val="24"/>
+          <w:szCs w:val="24"/>
+        </w:rPr>
+        <w:t xml:space="preserve"> de este documento.</w:t>
+      </w:r>
+    </w:p>
+    <w:p>
+      <w:pPr>
+        <w:pStyle w:val="Prrafodelista"/>
+        <w:spacing w:line="360" w:lineRule="auto"/>
+        <w:jc w:val="both"/>
+        <w:rPr>
+          <w:rFonts w:ascii="Arial" w:hAnsi="Arial" w:cs="Arial"/>
+          <w:sz w:val="24"/>
+          <w:szCs w:val="24"/>
+        </w:rPr>
+      </w:pPr>
+      <w:r>
+        <w:rPr>
+          <w:rFonts w:ascii="Arial" w:hAnsi="Arial" w:cs="Arial"/>
+          <w:b/>
+          <w:bCs/>
+          <w:sz w:val="24"/>
+          <w:szCs w:val="24"/>
+        </w:rPr>
+        <w:t xml:space="preserve">2. </w:t>
+      </w:r>
+      <w:proofErr w:type="spellStart"/>
+      <w:r>
+        <w:rPr>
+          <w:rFonts w:ascii="Arial" w:hAnsi="Arial" w:cs="Arial"/>
+          <w:b/>
+          <w:bCs/>
+          <w:sz w:val="24"/>
+          <w:szCs w:val="24"/>
+        </w:rPr>
+        <w:t>Css</w:t>
+      </w:r>
+      <w:proofErr w:type="spellEnd"/>
+      <w:r>
+        <w:rPr>
+          <w:rFonts w:ascii="Arial" w:hAnsi="Arial" w:cs="Arial"/>
+          <w:b/>
+          <w:bCs/>
+          <w:sz w:val="24"/>
+          <w:szCs w:val="24"/>
+        </w:rPr>
+        <w:t xml:space="preserve">: </w:t>
+      </w:r>
+      <w:r>
+        <w:rPr>
+          <w:rFonts w:ascii="Arial" w:hAnsi="Arial" w:cs="Arial"/>
+          <w:sz w:val="24"/>
+          <w:szCs w:val="24"/>
+        </w:rPr>
+        <w:t>contiene todos los estilos de las interfaces.</w:t>
+      </w:r>
+    </w:p>
+    <w:p>
+      <w:pPr>
+        <w:pStyle w:val="Prrafodelista"/>
+        <w:spacing w:line="360" w:lineRule="auto"/>
+        <w:jc w:val="both"/>
+        <w:rPr>
+          <w:rFonts w:ascii="Arial" w:hAnsi="Arial" w:cs="Arial"/>
+          <w:sz w:val="24"/>
+          <w:szCs w:val="24"/>
+        </w:rPr>
+      </w:pPr>
+      <w:r>
+        <w:rPr>
+          <w:rFonts w:ascii="Arial" w:hAnsi="Arial" w:cs="Arial"/>
+          <w:b/>
+          <w:bCs/>
+          <w:sz w:val="24"/>
+          <w:szCs w:val="24"/>
+        </w:rPr>
+        <w:t>3.</w:t>
+      </w:r>
+      <w:r>
+        <w:rPr>
+          <w:rFonts w:ascii="Arial" w:hAnsi="Arial" w:cs="Arial"/>
+          <w:sz w:val="24"/>
+          <w:szCs w:val="24"/>
+        </w:rPr>
+        <w:t xml:space="preserve"> </w:t>
+      </w:r>
+      <w:proofErr w:type="spellStart"/>
+      <w:r>
+        <w:rPr>
+          <w:rFonts w:ascii="Arial" w:hAnsi="Arial" w:cs="Arial"/>
+          <w:b/>
+          <w:bCs/>
+          <w:sz w:val="24"/>
+          <w:szCs w:val="24"/>
+        </w:rPr>
+        <w:t>Js</w:t>
+      </w:r>
+      <w:proofErr w:type="spellEnd"/>
+      <w:r>
+        <w:rPr>
+          <w:rFonts w:ascii="Arial" w:hAnsi="Arial" w:cs="Arial"/>
+          <w:b/>
+          <w:bCs/>
+          <w:sz w:val="24"/>
+          <w:szCs w:val="24"/>
+        </w:rPr>
+        <w:t xml:space="preserve">: </w:t>
+      </w:r>
+      <w:proofErr w:type="spellStart"/>
+      <w:r>
+        <w:rPr>
+          <w:rFonts w:ascii="Arial" w:hAnsi="Arial" w:cs="Arial"/>
+          <w:sz w:val="24"/>
+          <w:szCs w:val="24"/>
+        </w:rPr>
+        <w:t>contine</w:t>
+      </w:r>
+      <w:proofErr w:type="spellEnd"/>
+      <w:r>
+        <w:rPr>
+          <w:rFonts w:ascii="Arial" w:hAnsi="Arial" w:cs="Arial"/>
+          <w:sz w:val="24"/>
+          <w:szCs w:val="24"/>
+        </w:rPr>
+        <w:t xml:space="preserve"> los archivos de </w:t>
+      </w:r>
+      <w:proofErr w:type="spellStart"/>
+      <w:r>
+        <w:rPr>
+          <w:rFonts w:ascii="Arial" w:hAnsi="Arial" w:cs="Arial"/>
+          <w:sz w:val="24"/>
+          <w:szCs w:val="24"/>
+        </w:rPr>
+        <w:t>javascript</w:t>
+      </w:r>
+      <w:proofErr w:type="spellEnd"/>
+      <w:r>
+        <w:rPr>
+          <w:rFonts w:ascii="Arial" w:hAnsi="Arial" w:cs="Arial"/>
+          <w:sz w:val="24"/>
+          <w:szCs w:val="24"/>
+        </w:rPr>
+        <w:t xml:space="preserve"> para el dinamismo de la página web.</w:t>
+      </w:r>
+    </w:p>
+    <w:p>
+      <w:pPr>
+        <w:pStyle w:val="Prrafodelista"/>
+        <w:spacing w:line="360" w:lineRule="auto"/>
+        <w:jc w:val="both"/>
+        <w:rPr>
+          <w:rFonts w:ascii="Arial" w:hAnsi="Arial" w:cs="Arial"/>
+          <w:sz w:val="24"/>
+          <w:szCs w:val="24"/>
+        </w:rPr>
+      </w:pPr>
+      <w:r>
+        <w:rPr>
+          <w:rFonts w:ascii="Arial" w:hAnsi="Arial" w:cs="Arial"/>
+          <w:b/>
+          <w:bCs/>
+          <w:sz w:val="24"/>
+          <w:szCs w:val="24"/>
+        </w:rPr>
+        <w:t>4.</w:t>
+      </w:r>
+      <w:r>
+        <w:rPr>
+          <w:rFonts w:ascii="Arial" w:hAnsi="Arial" w:cs="Arial"/>
+          <w:sz w:val="24"/>
+          <w:szCs w:val="24"/>
+        </w:rPr>
+        <w:t xml:space="preserve"> </w:t>
+      </w:r>
+      <w:proofErr w:type="spellStart"/>
+      <w:r>
+        <w:rPr>
+          <w:rFonts w:ascii="Arial" w:hAnsi="Arial" w:cs="Arial"/>
+          <w:b/>
+          <w:bCs/>
+          <w:sz w:val="24"/>
+          <w:szCs w:val="24"/>
+        </w:rPr>
+        <w:t>Views</w:t>
+      </w:r>
+      <w:proofErr w:type="spellEnd"/>
+      <w:r>
+        <w:rPr>
+          <w:rFonts w:ascii="Arial" w:hAnsi="Arial" w:cs="Arial"/>
+          <w:b/>
+          <w:bCs/>
+          <w:sz w:val="24"/>
+          <w:szCs w:val="24"/>
+        </w:rPr>
+        <w:t xml:space="preserve">: </w:t>
+      </w:r>
+      <w:r>
+        <w:rPr>
+          <w:rFonts w:ascii="Arial" w:hAnsi="Arial" w:cs="Arial"/>
+          <w:sz w:val="24"/>
+          <w:szCs w:val="24"/>
+        </w:rPr>
+        <w:t>contiene todas las interfaces del sistema.</w:t>
+      </w:r>
+    </w:p>
+    <w:p>
+      <w:pPr>
+        <w:pStyle w:val="Prrafodelista"/>
+        <w:spacing w:line="360" w:lineRule="auto"/>
+        <w:jc w:val="both"/>
+        <w:rPr>
+          <w:rFonts w:ascii="Arial" w:hAnsi="Arial" w:cs="Arial"/>
+          <w:sz w:val="24"/>
+          <w:szCs w:val="24"/>
+        </w:rPr>
+      </w:pPr>
+      <w:r>
+        <w:rPr>
+          <w:rFonts w:ascii="Arial" w:hAnsi="Arial" w:cs="Arial"/>
+          <w:b/>
+          <w:bCs/>
+          <w:sz w:val="24"/>
+          <w:szCs w:val="24"/>
+        </w:rPr>
+        <w:t>5.</w:t>
+      </w:r>
+      <w:r>
+        <w:rPr>
+          <w:rFonts w:ascii="Arial" w:hAnsi="Arial" w:cs="Arial"/>
+          <w:sz w:val="24"/>
+          <w:szCs w:val="24"/>
+        </w:rPr>
+        <w:t xml:space="preserve"> </w:t>
+      </w:r>
+      <w:r>
+        <w:rPr>
+          <w:rFonts w:ascii="Arial" w:hAnsi="Arial" w:cs="Arial"/>
+          <w:b/>
+          <w:bCs/>
+          <w:sz w:val="24"/>
+          <w:szCs w:val="24"/>
+        </w:rPr>
+        <w:t xml:space="preserve">Index.html: </w:t>
+      </w:r>
+      <w:r>
+        <w:rPr>
+          <w:rFonts w:ascii="Arial" w:hAnsi="Arial" w:cs="Arial"/>
+          <w:sz w:val="24"/>
+          <w:szCs w:val="24"/>
+        </w:rPr>
+        <w:t>página principal por defecto que cargará al iniciar el sistema.</w:t>
+      </w:r>
+    </w:p>
+    <w:p>
+      <w:pPr>
+        <w:pStyle w:val="Prrafodelista"/>
+        <w:spacing w:line="360" w:lineRule="auto"/>
+        <w:jc w:val="both"/>
+        <w:rPr>
+          <w:rFonts w:ascii="Arial" w:hAnsi="Arial" w:cs="Arial"/>
+          <w:sz w:val="24"/>
+          <w:szCs w:val="24"/>
+        </w:rPr>
+      </w:pPr>
+    </w:p>
+    <w:p>
+      <w:pPr>
+        <w:spacing w:line="276" w:lineRule="auto"/>
+        <w:rPr>
+          <w:rFonts w:ascii="Arial" w:hAnsi="Arial" w:cs="Arial"/>
+          <w:sz w:val="24"/>
+          <w:szCs w:val="24"/>
+        </w:rPr>
+      </w:pPr>
+    </w:p>
+    <w:p>
+      <w:pPr>
+        <w:rPr>
+          <w:rFonts w:ascii="Arial" w:hAnsi="Arial" w:cs="Arial"/>
+          <w:sz w:val="24"/>
+          <w:szCs w:val="24"/>
+        </w:rPr>
+      </w:pPr>
+      <w:r>
+        <w:rPr>
+          <w:noProof/>
+        </w:rPr>
+        <w:drawing>
+          <wp:anchor distT="0" distB="0" distL="114300" distR="114300" simplePos="0" relativeHeight="251665408" behindDoc="1" locked="0" layoutInCell="1" allowOverlap="1" wp14:anchorId="2593FADC" wp14:editId="390B7FCC">
+            <wp:simplePos x="0" y="0"/>
+            <wp:positionH relativeFrom="column">
+              <wp:posOffset>609600</wp:posOffset>
+            </wp:positionH>
+            <wp:positionV relativeFrom="paragraph">
+              <wp:posOffset>177800</wp:posOffset>
+            </wp:positionV>
+            <wp:extent cx="914400" cy="453656"/>
+            <wp:effectExtent l="0" t="0" r="0" b="3810"/>
+            <wp:wrapNone/>
+            <wp:docPr id="8" name="Imagen 8" descr="Texto, Carta&#10;&#10;Descripción generada automáticamente"/>
+            <wp:cNvGraphicFramePr>
+              <a:graphicFrameLocks xmlns:a="http://schemas.openxmlformats.org/drawingml/2006/main" noChangeAspect="1"/>
+            </wp:cNvGraphicFramePr>
+            <a:graphic xmlns:a="http://schemas.openxmlformats.org/drawingml/2006/main">
+              <a:graphicData uri="http://schemas.openxmlformats.org/drawingml/2006/picture">
+                <pic:pic xmlns:pic="http://schemas.openxmlformats.org/drawingml/2006/picture">
+                  <pic:nvPicPr>
+                    <pic:cNvPr id="0" name="Picture 1"/>
+                    <pic:cNvPicPr>
+                      <a:picLocks noChangeAspect="1" noChangeArrowheads="1"/>
+                    </pic:cNvPicPr>
+                  </pic:nvPicPr>
+                  <pic:blipFill>
+                    <a:blip r:embed="rId13">
+                      <a:extLst>
+                        <a:ext uri="{28A0092B-C50C-407E-A947-70E740481C1C}">
+                          <a14:useLocalDpi xmlns:a14="http://schemas.microsoft.com/office/drawing/2010/main" val="0"/>
+                        </a:ext>
+                      </a:extLst>
+                    </a:blip>
+                    <a:srcRect/>
+                    <a:stretch>
+                      <a:fillRect/>
+                    </a:stretch>
+                  </pic:blipFill>
+                  <pic:spPr bwMode="auto">
+                    <a:xfrm>
+                      <a:off x="0" y="0"/>
+                      <a:ext cx="914400" cy="453656"/>
+                    </a:xfrm>
+                    <a:prstGeom prst="rect">
+                      <a:avLst/>
+                    </a:prstGeom>
+                    <a:noFill/>
+                    <a:ln>
+                      <a:noFill/>
+                    </a:ln>
+                  </pic:spPr>
+                </pic:pic>
+              </a:graphicData>
+            </a:graphic>
+          </wp:anchor>
+        </w:drawing>
+      </w:r>
     </w:p>
     <w:p>
       <w:pPr>
@@ -2606,7 +3575,7 @@
         </w:rPr>
         <w:t xml:space="preserve">email: </w:t>
       </w:r>
-      <w:hyperlink r:id="rId11" w:history="1">
+      <w:hyperlink r:id="rId14" w:history="1">
         <w:r>
           <w:rPr>
             <w:rStyle w:val="Hipervnculo"/>
@@ -2618,12 +3587,8 @@
     </w:p>
     <w:p>
       <w:pPr>
-        <w:spacing w:line="360" w:lineRule="auto"/>
-        <w:jc w:val="both"/>
-        <w:rPr>
-          <w:rFonts w:ascii="Arial" w:hAnsi="Arial" w:cs="Arial"/>
-          <w:b/>
-          <w:bCs/>
+        <w:rPr>
+          <w:rFonts w:ascii="Arial" w:hAnsi="Arial" w:cs="Arial"/>
           <w:sz w:val="24"/>
           <w:szCs w:val="24"/>
         </w:rPr>
@@ -2633,6 +3598,516 @@
       <w:pPr>
         <w:pStyle w:val="Prrafodelista"/>
         <w:spacing w:line="360" w:lineRule="auto"/>
+        <w:jc w:val="both"/>
+        <w:rPr>
+          <w:rFonts w:ascii="Arial" w:hAnsi="Arial" w:cs="Arial"/>
+          <w:sz w:val="24"/>
+          <w:szCs w:val="24"/>
+        </w:rPr>
+      </w:pPr>
+    </w:p>
+    <w:p>
+      <w:pPr>
+        <w:spacing w:line="360" w:lineRule="auto"/>
+        <w:jc w:val="both"/>
+        <w:rPr>
+          <w:rFonts w:ascii="Arial" w:hAnsi="Arial" w:cs="Arial"/>
+          <w:b/>
+          <w:bCs/>
+          <w:sz w:val="24"/>
+          <w:szCs w:val="24"/>
+        </w:rPr>
+      </w:pPr>
+    </w:p>
+    <w:p>
+      <w:pPr>
+        <w:spacing w:line="360" w:lineRule="auto"/>
+        <w:jc w:val="both"/>
+        <w:rPr>
+          <w:rFonts w:ascii="Arial" w:hAnsi="Arial" w:cs="Arial"/>
+          <w:b/>
+          <w:bCs/>
+          <w:sz w:val="24"/>
+          <w:szCs w:val="24"/>
+        </w:rPr>
+      </w:pPr>
+    </w:p>
+    <w:p>
+      <w:pPr>
+        <w:spacing w:line="360" w:lineRule="auto"/>
+        <w:jc w:val="both"/>
+        <w:rPr>
+          <w:rFonts w:ascii="Arial" w:hAnsi="Arial" w:cs="Arial"/>
+          <w:b/>
+          <w:bCs/>
+          <w:sz w:val="24"/>
+          <w:szCs w:val="24"/>
+        </w:rPr>
+      </w:pPr>
+    </w:p>
+    <w:p>
+      <w:pPr>
+        <w:spacing w:line="360" w:lineRule="auto"/>
+        <w:jc w:val="both"/>
+        <w:rPr>
+          <w:rFonts w:ascii="Arial" w:hAnsi="Arial" w:cs="Arial"/>
+          <w:b/>
+          <w:bCs/>
+          <w:sz w:val="24"/>
+          <w:szCs w:val="24"/>
+        </w:rPr>
+      </w:pPr>
+    </w:p>
+    <w:p>
+      <w:pPr>
+        <w:spacing w:line="360" w:lineRule="auto"/>
+        <w:jc w:val="both"/>
+        <w:rPr>
+          <w:rFonts w:ascii="Arial" w:hAnsi="Arial" w:cs="Arial"/>
+          <w:b/>
+          <w:bCs/>
+          <w:sz w:val="24"/>
+          <w:szCs w:val="24"/>
+        </w:rPr>
+      </w:pPr>
+    </w:p>
+    <w:p>
+      <w:pPr>
+        <w:spacing w:line="360" w:lineRule="auto"/>
+        <w:jc w:val="both"/>
+        <w:rPr>
+          <w:rFonts w:ascii="Arial" w:hAnsi="Arial" w:cs="Arial"/>
+          <w:b/>
+          <w:bCs/>
+          <w:sz w:val="24"/>
+          <w:szCs w:val="24"/>
+        </w:rPr>
+      </w:pPr>
+    </w:p>
+    <w:p>
+      <w:pPr>
+        <w:spacing w:line="360" w:lineRule="auto"/>
+        <w:jc w:val="both"/>
+        <w:rPr>
+          <w:rFonts w:ascii="Arial" w:hAnsi="Arial" w:cs="Arial"/>
+          <w:b/>
+          <w:bCs/>
+          <w:sz w:val="24"/>
+          <w:szCs w:val="24"/>
+        </w:rPr>
+      </w:pPr>
+    </w:p>
+    <w:p>
+      <w:pPr>
+        <w:spacing w:line="360" w:lineRule="auto"/>
+        <w:jc w:val="both"/>
+        <w:rPr>
+          <w:rFonts w:ascii="Arial" w:hAnsi="Arial" w:cs="Arial"/>
+          <w:b/>
+          <w:bCs/>
+          <w:sz w:val="24"/>
+          <w:szCs w:val="24"/>
+        </w:rPr>
+      </w:pPr>
+    </w:p>
+    <w:p>
+      <w:pPr>
+        <w:spacing w:line="360" w:lineRule="auto"/>
+        <w:jc w:val="both"/>
+        <w:rPr>
+          <w:rFonts w:ascii="Arial" w:hAnsi="Arial" w:cs="Arial"/>
+          <w:b/>
+          <w:bCs/>
+          <w:sz w:val="24"/>
+          <w:szCs w:val="24"/>
+        </w:rPr>
+      </w:pPr>
+    </w:p>
+    <w:p>
+      <w:pPr>
+        <w:spacing w:line="360" w:lineRule="auto"/>
+        <w:jc w:val="both"/>
+        <w:rPr>
+          <w:rFonts w:ascii="Arial" w:hAnsi="Arial" w:cs="Arial"/>
+          <w:b/>
+          <w:bCs/>
+          <w:sz w:val="24"/>
+          <w:szCs w:val="24"/>
+        </w:rPr>
+      </w:pPr>
+    </w:p>
+    <w:p>
+      <w:pPr>
+        <w:spacing w:line="360" w:lineRule="auto"/>
+        <w:jc w:val="both"/>
+        <w:rPr>
+          <w:rFonts w:ascii="Arial" w:hAnsi="Arial" w:cs="Arial"/>
+          <w:b/>
+          <w:bCs/>
+          <w:sz w:val="24"/>
+          <w:szCs w:val="24"/>
+        </w:rPr>
+      </w:pPr>
+    </w:p>
+    <w:p>
+      <w:pPr>
+        <w:spacing w:line="360" w:lineRule="auto"/>
+        <w:jc w:val="both"/>
+        <w:rPr>
+          <w:rFonts w:ascii="Arial" w:hAnsi="Arial" w:cs="Arial"/>
+          <w:b/>
+          <w:bCs/>
+          <w:sz w:val="24"/>
+          <w:szCs w:val="24"/>
+        </w:rPr>
+      </w:pPr>
+    </w:p>
+    <w:p>
+      <w:pPr>
+        <w:spacing w:line="360" w:lineRule="auto"/>
+        <w:jc w:val="both"/>
+        <w:rPr>
+          <w:rFonts w:ascii="Arial" w:hAnsi="Arial" w:cs="Arial"/>
+          <w:b/>
+          <w:bCs/>
+          <w:sz w:val="24"/>
+          <w:szCs w:val="24"/>
+        </w:rPr>
+      </w:pPr>
+    </w:p>
+    <w:p>
+      <w:pPr>
+        <w:spacing w:line="360" w:lineRule="auto"/>
+        <w:jc w:val="both"/>
+        <w:rPr>
+          <w:rFonts w:ascii="Arial" w:hAnsi="Arial" w:cs="Arial"/>
+          <w:b/>
+          <w:bCs/>
+          <w:sz w:val="24"/>
+          <w:szCs w:val="24"/>
+        </w:rPr>
+      </w:pPr>
+    </w:p>
+    <w:p>
+      <w:pPr>
+        <w:spacing w:line="360" w:lineRule="auto"/>
+        <w:jc w:val="both"/>
+        <w:rPr>
+          <w:rFonts w:ascii="Arial" w:hAnsi="Arial" w:cs="Arial"/>
+          <w:b/>
+          <w:bCs/>
+          <w:sz w:val="24"/>
+          <w:szCs w:val="24"/>
+        </w:rPr>
+      </w:pPr>
+    </w:p>
+    <w:p>
+      <w:pPr>
+        <w:spacing w:line="360" w:lineRule="auto"/>
+        <w:jc w:val="both"/>
+        <w:rPr>
+          <w:rFonts w:ascii="Arial" w:hAnsi="Arial" w:cs="Arial"/>
+          <w:b/>
+          <w:bCs/>
+          <w:sz w:val="24"/>
+          <w:szCs w:val="24"/>
+        </w:rPr>
+      </w:pPr>
+    </w:p>
+    <w:p>
+      <w:pPr>
+        <w:spacing w:line="360" w:lineRule="auto"/>
+        <w:jc w:val="both"/>
+        <w:rPr>
+          <w:rFonts w:ascii="Arial" w:hAnsi="Arial" w:cs="Arial"/>
+          <w:b/>
+          <w:bCs/>
+          <w:sz w:val="24"/>
+          <w:szCs w:val="24"/>
+        </w:rPr>
+      </w:pPr>
+    </w:p>
+    <w:p>
+      <w:pPr>
+        <w:spacing w:line="360" w:lineRule="auto"/>
+        <w:jc w:val="both"/>
+        <w:rPr>
+          <w:rFonts w:ascii="Arial" w:hAnsi="Arial" w:cs="Arial"/>
+          <w:b/>
+          <w:bCs/>
+          <w:sz w:val="24"/>
+          <w:szCs w:val="24"/>
+        </w:rPr>
+      </w:pPr>
+    </w:p>
+    <w:p>
+      <w:pPr>
+        <w:spacing w:line="360" w:lineRule="auto"/>
+        <w:jc w:val="both"/>
+        <w:rPr>
+          <w:rFonts w:ascii="Arial" w:hAnsi="Arial" w:cs="Arial"/>
+          <w:b/>
+          <w:bCs/>
+          <w:sz w:val="24"/>
+          <w:szCs w:val="24"/>
+        </w:rPr>
+      </w:pPr>
+    </w:p>
+    <w:p>
+      <w:pPr>
+        <w:spacing w:line="360" w:lineRule="auto"/>
+        <w:jc w:val="both"/>
+        <w:rPr>
+          <w:rFonts w:ascii="Arial" w:hAnsi="Arial" w:cs="Arial"/>
+          <w:b/>
+          <w:bCs/>
+          <w:sz w:val="24"/>
+          <w:szCs w:val="24"/>
+        </w:rPr>
+      </w:pPr>
+    </w:p>
+    <w:p>
+      <w:pPr>
+        <w:spacing w:line="360" w:lineRule="auto"/>
+        <w:jc w:val="both"/>
+        <w:rPr>
+          <w:rFonts w:ascii="Arial" w:hAnsi="Arial" w:cs="Arial"/>
+          <w:b/>
+          <w:bCs/>
+          <w:sz w:val="24"/>
+          <w:szCs w:val="24"/>
+        </w:rPr>
+      </w:pPr>
+    </w:p>
+    <w:p>
+      <w:pPr>
+        <w:spacing w:line="360" w:lineRule="auto"/>
+        <w:jc w:val="both"/>
+        <w:rPr>
+          <w:rFonts w:ascii="Arial" w:hAnsi="Arial" w:cs="Arial"/>
+          <w:b/>
+          <w:bCs/>
+          <w:sz w:val="24"/>
+          <w:szCs w:val="24"/>
+        </w:rPr>
+      </w:pPr>
+    </w:p>
+    <w:p>
+      <w:pPr>
+        <w:spacing w:line="360" w:lineRule="auto"/>
+        <w:jc w:val="both"/>
+        <w:rPr>
+          <w:rFonts w:ascii="Arial" w:hAnsi="Arial" w:cs="Arial"/>
+          <w:b/>
+          <w:bCs/>
+          <w:sz w:val="24"/>
+          <w:szCs w:val="24"/>
+        </w:rPr>
+      </w:pPr>
+    </w:p>
+    <w:p>
+      <w:pPr>
+        <w:spacing w:line="360" w:lineRule="auto"/>
+        <w:jc w:val="both"/>
+        <w:rPr>
+          <w:rFonts w:ascii="Arial" w:hAnsi="Arial" w:cs="Arial"/>
+          <w:b/>
+          <w:bCs/>
+          <w:sz w:val="24"/>
+          <w:szCs w:val="24"/>
+        </w:rPr>
+      </w:pPr>
+    </w:p>
+    <w:p>
+      <w:pPr>
+        <w:spacing w:line="360" w:lineRule="auto"/>
+        <w:jc w:val="both"/>
+        <w:rPr>
+          <w:rFonts w:ascii="Arial" w:hAnsi="Arial" w:cs="Arial"/>
+          <w:b/>
+          <w:bCs/>
+          <w:sz w:val="24"/>
+          <w:szCs w:val="24"/>
+        </w:rPr>
+      </w:pPr>
+    </w:p>
+    <w:p>
+      <w:pPr>
+        <w:spacing w:line="360" w:lineRule="auto"/>
+        <w:jc w:val="both"/>
+        <w:rPr>
+          <w:rFonts w:ascii="Arial" w:hAnsi="Arial" w:cs="Arial"/>
+          <w:b/>
+          <w:bCs/>
+          <w:sz w:val="24"/>
+          <w:szCs w:val="24"/>
+        </w:rPr>
+      </w:pPr>
+    </w:p>
+    <w:p>
+      <w:pPr>
+        <w:spacing w:line="360" w:lineRule="auto"/>
+        <w:jc w:val="both"/>
+        <w:rPr>
+          <w:rFonts w:ascii="Arial" w:hAnsi="Arial" w:cs="Arial"/>
+          <w:b/>
+          <w:bCs/>
+          <w:sz w:val="24"/>
+          <w:szCs w:val="24"/>
+        </w:rPr>
+      </w:pPr>
+    </w:p>
+    <w:p>
+      <w:pPr>
+        <w:spacing w:line="360" w:lineRule="auto"/>
+        <w:jc w:val="both"/>
+        <w:rPr>
+          <w:rFonts w:ascii="Arial" w:hAnsi="Arial" w:cs="Arial"/>
+          <w:b/>
+          <w:bCs/>
+          <w:sz w:val="24"/>
+          <w:szCs w:val="24"/>
+        </w:rPr>
+      </w:pPr>
+    </w:p>
+    <w:p>
+      <w:pPr>
+        <w:spacing w:line="360" w:lineRule="auto"/>
+        <w:jc w:val="both"/>
+        <w:rPr>
+          <w:rFonts w:ascii="Arial" w:hAnsi="Arial" w:cs="Arial"/>
+          <w:b/>
+          <w:bCs/>
+          <w:sz w:val="24"/>
+          <w:szCs w:val="24"/>
+        </w:rPr>
+      </w:pPr>
+    </w:p>
+    <w:p>
+      <w:pPr>
+        <w:spacing w:line="360" w:lineRule="auto"/>
+        <w:jc w:val="both"/>
+        <w:rPr>
+          <w:rFonts w:ascii="Arial" w:hAnsi="Arial" w:cs="Arial"/>
+          <w:b/>
+          <w:bCs/>
+          <w:sz w:val="24"/>
+          <w:szCs w:val="24"/>
+        </w:rPr>
+      </w:pPr>
+    </w:p>
+    <w:p>
+      <w:pPr>
+        <w:spacing w:line="360" w:lineRule="auto"/>
+        <w:jc w:val="both"/>
+        <w:rPr>
+          <w:rFonts w:ascii="Arial" w:hAnsi="Arial" w:cs="Arial"/>
+          <w:b/>
+          <w:bCs/>
+          <w:sz w:val="24"/>
+          <w:szCs w:val="24"/>
+        </w:rPr>
+      </w:pPr>
+    </w:p>
+    <w:p>
+      <w:pPr>
+        <w:rPr>
+          <w:rFonts w:ascii="Arial" w:hAnsi="Arial" w:cs="Arial"/>
+          <w:sz w:val="24"/>
+          <w:szCs w:val="24"/>
+        </w:rPr>
+      </w:pPr>
+    </w:p>
+    <w:p>
+      <w:pPr>
+        <w:rPr>
+          <w:rFonts w:ascii="Arial" w:hAnsi="Arial" w:cs="Arial"/>
+          <w:sz w:val="24"/>
+          <w:szCs w:val="24"/>
+        </w:rPr>
+      </w:pPr>
+      <w:r>
+        <w:rPr>
+          <w:rFonts w:ascii="Arial" w:hAnsi="Arial" w:cs="Arial"/>
+          <w:sz w:val="24"/>
+          <w:szCs w:val="24"/>
+        </w:rPr>
+        <w:t>______________________________</w:t>
+      </w:r>
+    </w:p>
+    <w:p>
+      <w:pPr>
+        <w:pStyle w:val="Prrafodelista"/>
+        <w:jc w:val="both"/>
+        <w:rPr>
+          <w:rFonts w:ascii="Arial" w:hAnsi="Arial" w:cs="Arial"/>
+          <w:b/>
+          <w:bCs/>
+        </w:rPr>
+      </w:pPr>
+    </w:p>
+    <w:p>
+      <w:pPr>
+        <w:pStyle w:val="Prrafodelista"/>
+        <w:jc w:val="both"/>
+        <w:rPr>
+          <w:rFonts w:ascii="Arial" w:hAnsi="Arial" w:cs="Arial"/>
+          <w:b/>
+          <w:bCs/>
+        </w:rPr>
+      </w:pPr>
+      <w:r>
+        <w:rPr>
+          <w:rFonts w:ascii="Arial" w:hAnsi="Arial" w:cs="Arial"/>
+          <w:b/>
+          <w:bCs/>
+        </w:rPr>
+        <w:t>Hecho por Orozco Adrián.</w:t>
+      </w:r>
+    </w:p>
+    <w:p>
+      <w:pPr>
+        <w:pStyle w:val="Prrafodelista"/>
+        <w:jc w:val="both"/>
+        <w:rPr>
+          <w:rFonts w:ascii="Arial" w:hAnsi="Arial" w:cs="Arial"/>
+        </w:rPr>
+      </w:pPr>
+      <w:r>
+        <w:rPr>
+          <w:rFonts w:ascii="Arial" w:hAnsi="Arial" w:cs="Arial"/>
+          <w:b/>
+          <w:bCs/>
+        </w:rPr>
+        <w:t xml:space="preserve">email: </w:t>
+      </w:r>
+      <w:hyperlink r:id="rId15" w:history="1">
+        <w:r>
+          <w:rPr>
+            <w:rStyle w:val="Hipervnculo"/>
+            <w:rFonts w:ascii="Arial" w:hAnsi="Arial" w:cs="Arial"/>
+          </w:rPr>
+          <w:t>adrianenriqueorozco@gmail.com</w:t>
+        </w:r>
+      </w:hyperlink>
+    </w:p>
+    <w:p>
+      <w:pPr>
+        <w:spacing w:line="360" w:lineRule="auto"/>
+        <w:jc w:val="both"/>
+        <w:rPr>
+          <w:rFonts w:ascii="Arial" w:hAnsi="Arial" w:cs="Arial"/>
+          <w:b/>
+          <w:bCs/>
+          <w:sz w:val="24"/>
+          <w:szCs w:val="24"/>
+        </w:rPr>
+      </w:pPr>
+    </w:p>
+    <w:p>
+      <w:pPr>
+        <w:pStyle w:val="Prrafodelista"/>
+        <w:spacing w:line="360" w:lineRule="auto"/>
         <w:rPr>
           <w:rFonts w:ascii="Arial" w:hAnsi="Arial" w:cs="Arial"/>
           <w:sz w:val="24"/>
@@ -2651,7 +4126,7 @@
       </w:pPr>
     </w:p>
     <w:sectPr>
-      <w:headerReference w:type="default" r:id="rId12"/>
+      <w:headerReference w:type="default" r:id="rId16"/>
       <w:pgSz w:w="12240" w:h="15840"/>
       <w:pgMar w:top="1417" w:right="1701" w:bottom="1417" w:left="1701" w:header="708" w:footer="708" w:gutter="0"/>
       <w:pgBorders w:offsetFrom="page">
@@ -2715,6 +4190,7 @@
         <w:docPartUnique/>
       </w:docPartObj>
     </w:sdtPr>
+    <w:sdtEndPr/>
     <w:sdtContent>
       <w:p>
         <w:pPr>
@@ -2780,6 +4256,119 @@
 <file path=word/numbering.xml><?xml version="1.0" encoding="utf-8"?>
 <w:numbering xmlns:wpc="http://schemas.microsoft.com/office/word/2010/wordprocessingCanvas" xmlns:cx="http://schemas.microsoft.com/office/drawing/2014/chartex" xmlns:cx1="http://schemas.microsoft.com/office/drawing/2015/9/8/chartex" xmlns:cx2="http://schemas.microsoft.com/office/drawing/2015/10/21/chartex" xmlns:cx3="http://schemas.microsoft.com/office/drawing/2016/5/9/chartex" xmlns:cx4="http://schemas.microsoft.com/office/drawing/2016/5/10/chartex" xmlns:cx5="http://schemas.microsoft.com/office/drawing/2016/5/11/chartex" xmlns:cx6="http://schemas.microsoft.com/office/drawing/2016/5/12/chartex" xmlns:cx7="http://schemas.microsoft.com/office/drawing/2016/5/13/chartex" xmlns:cx8="http://schemas.microsoft.com/office/drawing/2016/5/14/chartex" xmlns:mc="http://schemas.openxmlformats.org/markup-compatibility/2006" xmlns:aink="http://schemas.microsoft.com/office/drawing/2016/ink" xmlns:am3d="http://schemas.microsoft.com/office/drawing/2017/model3d" xmlns:o="urn:schemas-microsoft-com:office:office" xmlns:r="http://schemas.openxmlformats.org/officeDocument/2006/relationships" xmlns:m="http://schemas.openxmlformats.org/officeDocument/2006/math" xmlns:v="urn:schemas-microsoft-com:vml" xmlns:wp14="http://schemas.microsoft.com/office/word/2010/wordprocessingDrawing" xmlns:wp="http://schemas.openxmlformats.org/drawingml/2006/wordprocessingDrawing" xmlns:w10="urn:schemas-microsoft-com:office:word" xmlns:w="http://schemas.openxmlformats.org/wordprocessingml/2006/main" xmlns:w14="http://schemas.microsoft.com/office/word/2010/wordml" xmlns:w15="http://schemas.microsoft.com/office/word/2012/wordml" xmlns:w16cid="http://schemas.microsoft.com/office/word/2016/wordml/cid" xmlns:w16se="http://schemas.microsoft.com/office/word/2015/wordml/symex" xmlns:wpg="http://schemas.microsoft.com/office/word/2010/wordprocessingGroup" xmlns:wpi="http://schemas.microsoft.com/office/word/2010/wordprocessingInk" xmlns:wne="http://schemas.microsoft.com/office/word/2006/wordml" xmlns:wps="http://schemas.microsoft.com/office/word/2010/wordprocessingShape" mc:Ignorable="w14 w15 w16se w16cid wp14">
   <w:abstractNum w:abstractNumId="0" w15:restartNumberingAfterBreak="0">
+    <w:nsid w:val="0E852B7B"/>
+    <w:multiLevelType w:val="hybridMultilevel"/>
+    <w:tmpl w:val="AFC222F2"/>
+    <w:lvl w:ilvl="0" w:tplc="240A0001">
+      <w:start w:val="1"/>
+      <w:numFmt w:val="bullet"/>
+      <w:lvlText w:val=""/>
+      <w:lvlJc w:val="left"/>
+      <w:pPr>
+        <w:ind w:left="720" w:hanging="360"/>
+      </w:pPr>
+      <w:rPr>
+        <w:rFonts w:ascii="Symbol" w:hAnsi="Symbol" w:hint="default"/>
+      </w:rPr>
+    </w:lvl>
+    <w:lvl w:ilvl="1" w:tplc="240A0003" w:tentative="1">
+      <w:start w:val="1"/>
+      <w:numFmt w:val="bullet"/>
+      <w:lvlText w:val="o"/>
+      <w:lvlJc w:val="left"/>
+      <w:pPr>
+        <w:ind w:left="1440" w:hanging="360"/>
+      </w:pPr>
+      <w:rPr>
+        <w:rFonts w:ascii="Courier New" w:hAnsi="Courier New" w:cs="Courier New" w:hint="default"/>
+      </w:rPr>
+    </w:lvl>
+    <w:lvl w:ilvl="2" w:tplc="240A0005" w:tentative="1">
+      <w:start w:val="1"/>
+      <w:numFmt w:val="bullet"/>
+      <w:lvlText w:val=""/>
+      <w:lvlJc w:val="left"/>
+      <w:pPr>
+        <w:ind w:left="2160" w:hanging="360"/>
+      </w:pPr>
+      <w:rPr>
+        <w:rFonts w:ascii="Wingdings" w:hAnsi="Wingdings" w:hint="default"/>
+      </w:rPr>
+    </w:lvl>
+    <w:lvl w:ilvl="3" w:tplc="240A0001" w:tentative="1">
+      <w:start w:val="1"/>
+      <w:numFmt w:val="bullet"/>
+      <w:lvlText w:val=""/>
+      <w:lvlJc w:val="left"/>
+      <w:pPr>
+        <w:ind w:left="2880" w:hanging="360"/>
+      </w:pPr>
+      <w:rPr>
+        <w:rFonts w:ascii="Symbol" w:hAnsi="Symbol" w:hint="default"/>
+      </w:rPr>
+    </w:lvl>
+    <w:lvl w:ilvl="4" w:tplc="240A0003" w:tentative="1">
+      <w:start w:val="1"/>
+      <w:numFmt w:val="bullet"/>
+      <w:lvlText w:val="o"/>
+      <w:lvlJc w:val="left"/>
+      <w:pPr>
+        <w:ind w:left="3600" w:hanging="360"/>
+      </w:pPr>
+      <w:rPr>
+        <w:rFonts w:ascii="Courier New" w:hAnsi="Courier New" w:cs="Courier New" w:hint="default"/>
+      </w:rPr>
+    </w:lvl>
+    <w:lvl w:ilvl="5" w:tplc="240A0005" w:tentative="1">
+      <w:start w:val="1"/>
+      <w:numFmt w:val="bullet"/>
+      <w:lvlText w:val=""/>
+      <w:lvlJc w:val="left"/>
+      <w:pPr>
+        <w:ind w:left="4320" w:hanging="360"/>
+      </w:pPr>
+      <w:rPr>
+        <w:rFonts w:ascii="Wingdings" w:hAnsi="Wingdings" w:hint="default"/>
+      </w:rPr>
+    </w:lvl>
+    <w:lvl w:ilvl="6" w:tplc="240A0001" w:tentative="1">
+      <w:start w:val="1"/>
+      <w:numFmt w:val="bullet"/>
+      <w:lvlText w:val=""/>
+      <w:lvlJc w:val="left"/>
+      <w:pPr>
+        <w:ind w:left="5040" w:hanging="360"/>
+      </w:pPr>
+      <w:rPr>
+        <w:rFonts w:ascii="Symbol" w:hAnsi="Symbol" w:hint="default"/>
+      </w:rPr>
+    </w:lvl>
+    <w:lvl w:ilvl="7" w:tplc="240A0003" w:tentative="1">
+      <w:start w:val="1"/>
+      <w:numFmt w:val="bullet"/>
+      <w:lvlText w:val="o"/>
+      <w:lvlJc w:val="left"/>
+      <w:pPr>
+        <w:ind w:left="5760" w:hanging="360"/>
+      </w:pPr>
+      <w:rPr>
+        <w:rFonts w:ascii="Courier New" w:hAnsi="Courier New" w:cs="Courier New" w:hint="default"/>
+      </w:rPr>
+    </w:lvl>
+    <w:lvl w:ilvl="8" w:tplc="240A0005" w:tentative="1">
+      <w:start w:val="1"/>
+      <w:numFmt w:val="bullet"/>
+      <w:lvlText w:val=""/>
+      <w:lvlJc w:val="left"/>
+      <w:pPr>
+        <w:ind w:left="6480" w:hanging="360"/>
+      </w:pPr>
+      <w:rPr>
+        <w:rFonts w:ascii="Wingdings" w:hAnsi="Wingdings" w:hint="default"/>
+      </w:rPr>
+    </w:lvl>
+  </w:abstractNum>
+  <w:abstractNum w:abstractNumId="1" w15:restartNumberingAfterBreak="0">
     <w:nsid w:val="108F6DB8"/>
     <w:multiLevelType w:val="hybridMultilevel"/>
     <w:tmpl w:val="D496059A"/>
@@ -2868,7 +4457,7 @@
       </w:pPr>
     </w:lvl>
   </w:abstractNum>
-  <w:abstractNum w:abstractNumId="1" w15:restartNumberingAfterBreak="0">
+  <w:abstractNum w:abstractNumId="2" w15:restartNumberingAfterBreak="0">
     <w:nsid w:val="16FD2C53"/>
     <w:multiLevelType w:val="hybridMultilevel"/>
     <w:tmpl w:val="A7004E96"/>
@@ -2957,7 +4546,7 @@
       </w:pPr>
     </w:lvl>
   </w:abstractNum>
-  <w:abstractNum w:abstractNumId="2" w15:restartNumberingAfterBreak="0">
+  <w:abstractNum w:abstractNumId="3" w15:restartNumberingAfterBreak="0">
     <w:nsid w:val="18484986"/>
     <w:multiLevelType w:val="hybridMultilevel"/>
     <w:tmpl w:val="B3A445D8"/>
@@ -3043,7 +4632,7 @@
       </w:pPr>
     </w:lvl>
   </w:abstractNum>
-  <w:abstractNum w:abstractNumId="3" w15:restartNumberingAfterBreak="0">
+  <w:abstractNum w:abstractNumId="4" w15:restartNumberingAfterBreak="0">
     <w:nsid w:val="1BB11150"/>
     <w:multiLevelType w:val="multilevel"/>
     <w:tmpl w:val="4A9C97C0"/>
@@ -3164,7 +4753,7 @@
       </w:rPr>
     </w:lvl>
   </w:abstractNum>
-  <w:abstractNum w:abstractNumId="4" w15:restartNumberingAfterBreak="0">
+  <w:abstractNum w:abstractNumId="5" w15:restartNumberingAfterBreak="0">
     <w:nsid w:val="3CBE0FCC"/>
     <w:multiLevelType w:val="hybridMultilevel"/>
     <w:tmpl w:val="607AA3D2"/>
@@ -3277,7 +4866,97 @@
       </w:rPr>
     </w:lvl>
   </w:abstractNum>
-  <w:abstractNum w:abstractNumId="5" w15:restartNumberingAfterBreak="0">
+  <w:abstractNum w:abstractNumId="6" w15:restartNumberingAfterBreak="0">
+    <w:nsid w:val="3E231749"/>
+    <w:multiLevelType w:val="hybridMultilevel"/>
+    <w:tmpl w:val="FBEE6E98"/>
+    <w:lvl w:ilvl="0" w:tplc="8DC68010">
+      <w:start w:val="1"/>
+      <w:numFmt w:val="decimal"/>
+      <w:lvlText w:val="%1."/>
+      <w:lvlJc w:val="left"/>
+      <w:pPr>
+        <w:ind w:left="785" w:hanging="360"/>
+      </w:pPr>
+      <w:rPr>
+        <w:b/>
+        <w:bCs/>
+      </w:rPr>
+    </w:lvl>
+    <w:lvl w:ilvl="1" w:tplc="240A0019" w:tentative="1">
+      <w:start w:val="1"/>
+      <w:numFmt w:val="lowerLetter"/>
+      <w:lvlText w:val="%2."/>
+      <w:lvlJc w:val="left"/>
+      <w:pPr>
+        <w:ind w:left="1505" w:hanging="360"/>
+      </w:pPr>
+    </w:lvl>
+    <w:lvl w:ilvl="2" w:tplc="240A001B" w:tentative="1">
+      <w:start w:val="1"/>
+      <w:numFmt w:val="lowerRoman"/>
+      <w:lvlText w:val="%3."/>
+      <w:lvlJc w:val="right"/>
+      <w:pPr>
+        <w:ind w:left="2225" w:hanging="180"/>
+      </w:pPr>
+    </w:lvl>
+    <w:lvl w:ilvl="3" w:tplc="240A000F" w:tentative="1">
+      <w:start w:val="1"/>
+      <w:numFmt w:val="decimal"/>
+      <w:lvlText w:val="%4."/>
+      <w:lvlJc w:val="left"/>
+      <w:pPr>
+        <w:ind w:left="2945" w:hanging="360"/>
+      </w:pPr>
+    </w:lvl>
+    <w:lvl w:ilvl="4" w:tplc="240A0019" w:tentative="1">
+      <w:start w:val="1"/>
+      <w:numFmt w:val="lowerLetter"/>
+      <w:lvlText w:val="%5."/>
+      <w:lvlJc w:val="left"/>
+      <w:pPr>
+        <w:ind w:left="3665" w:hanging="360"/>
+      </w:pPr>
+    </w:lvl>
+    <w:lvl w:ilvl="5" w:tplc="240A001B" w:tentative="1">
+      <w:start w:val="1"/>
+      <w:numFmt w:val="lowerRoman"/>
+      <w:lvlText w:val="%6."/>
+      <w:lvlJc w:val="right"/>
+      <w:pPr>
+        <w:ind w:left="4385" w:hanging="180"/>
+      </w:pPr>
+    </w:lvl>
+    <w:lvl w:ilvl="6" w:tplc="240A000F" w:tentative="1">
+      <w:start w:val="1"/>
+      <w:numFmt w:val="decimal"/>
+      <w:lvlText w:val="%7."/>
+      <w:lvlJc w:val="left"/>
+      <w:pPr>
+        <w:ind w:left="5105" w:hanging="360"/>
+      </w:pPr>
+    </w:lvl>
+    <w:lvl w:ilvl="7" w:tplc="240A0019" w:tentative="1">
+      <w:start w:val="1"/>
+      <w:numFmt w:val="lowerLetter"/>
+      <w:lvlText w:val="%8."/>
+      <w:lvlJc w:val="left"/>
+      <w:pPr>
+        <w:ind w:left="5825" w:hanging="360"/>
+      </w:pPr>
+    </w:lvl>
+    <w:lvl w:ilvl="8" w:tplc="240A001B" w:tentative="1">
+      <w:start w:val="1"/>
+      <w:numFmt w:val="lowerRoman"/>
+      <w:lvlText w:val="%9."/>
+      <w:lvlJc w:val="right"/>
+      <w:pPr>
+        <w:ind w:left="6545" w:hanging="180"/>
+      </w:pPr>
+    </w:lvl>
+  </w:abstractNum>
+  <w:abstractNum w:abstractNumId="7" w15:restartNumberingAfterBreak="0">
     <w:nsid w:val="3F8E7AEF"/>
     <w:multiLevelType w:val="hybridMultilevel"/>
     <w:tmpl w:val="C8CE01EE"/>
@@ -3363,7 +5042,7 @@
       </w:pPr>
     </w:lvl>
   </w:abstractNum>
-  <w:abstractNum w:abstractNumId="6" w15:restartNumberingAfterBreak="0">
+  <w:abstractNum w:abstractNumId="8" w15:restartNumberingAfterBreak="0">
     <w:nsid w:val="40930C07"/>
     <w:multiLevelType w:val="hybridMultilevel"/>
     <w:tmpl w:val="7E8C3F0E"/>
@@ -3452,7 +5131,7 @@
       </w:pPr>
     </w:lvl>
   </w:abstractNum>
-  <w:abstractNum w:abstractNumId="7" w15:restartNumberingAfterBreak="0">
+  <w:abstractNum w:abstractNumId="9" w15:restartNumberingAfterBreak="0">
     <w:nsid w:val="5C480DC5"/>
     <w:multiLevelType w:val="hybridMultilevel"/>
     <w:tmpl w:val="21C4D394"/>
@@ -3538,7 +5217,97 @@
       </w:pPr>
     </w:lvl>
   </w:abstractNum>
-  <w:abstractNum w:abstractNumId="8" w15:restartNumberingAfterBreak="0">
+  <w:abstractNum w:abstractNumId="10" w15:restartNumberingAfterBreak="0">
+    <w:nsid w:val="6A481053"/>
+    <w:multiLevelType w:val="hybridMultilevel"/>
+    <w:tmpl w:val="14B81590"/>
+    <w:lvl w:ilvl="0" w:tplc="8DC68010">
+      <w:start w:val="1"/>
+      <w:numFmt w:val="decimal"/>
+      <w:lvlText w:val="%1."/>
+      <w:lvlJc w:val="left"/>
+      <w:pPr>
+        <w:ind w:left="720" w:hanging="360"/>
+      </w:pPr>
+      <w:rPr>
+        <w:b/>
+        <w:bCs/>
+      </w:rPr>
+    </w:lvl>
+    <w:lvl w:ilvl="1" w:tplc="240A0019" w:tentative="1">
+      <w:start w:val="1"/>
+      <w:numFmt w:val="lowerLetter"/>
+      <w:lvlText w:val="%2."/>
+      <w:lvlJc w:val="left"/>
+      <w:pPr>
+        <w:ind w:left="1440" w:hanging="360"/>
+      </w:pPr>
+    </w:lvl>
+    <w:lvl w:ilvl="2" w:tplc="240A001B" w:tentative="1">
+      <w:start w:val="1"/>
+      <w:numFmt w:val="lowerRoman"/>
+      <w:lvlText w:val="%3."/>
+      <w:lvlJc w:val="right"/>
+      <w:pPr>
+        <w:ind w:left="2160" w:hanging="180"/>
+      </w:pPr>
+    </w:lvl>
+    <w:lvl w:ilvl="3" w:tplc="240A000F" w:tentative="1">
+      <w:start w:val="1"/>
+      <w:numFmt w:val="decimal"/>
+      <w:lvlText w:val="%4."/>
+      <w:lvlJc w:val="left"/>
+      <w:pPr>
+        <w:ind w:left="2880" w:hanging="360"/>
+      </w:pPr>
+    </w:lvl>
+    <w:lvl w:ilvl="4" w:tplc="240A0019" w:tentative="1">
+      <w:start w:val="1"/>
+      <w:numFmt w:val="lowerLetter"/>
+      <w:lvlText w:val="%5."/>
+      <w:lvlJc w:val="left"/>
+      <w:pPr>
+        <w:ind w:left="3600" w:hanging="360"/>
+      </w:pPr>
+    </w:lvl>
+    <w:lvl w:ilvl="5" w:tplc="240A001B" w:tentative="1">
+      <w:start w:val="1"/>
+      <w:numFmt w:val="lowerRoman"/>
+      <w:lvlText w:val="%6."/>
+      <w:lvlJc w:val="right"/>
+      <w:pPr>
+        <w:ind w:left="4320" w:hanging="180"/>
+      </w:pPr>
+    </w:lvl>
+    <w:lvl w:ilvl="6" w:tplc="240A000F" w:tentative="1">
+      <w:start w:val="1"/>
+      <w:numFmt w:val="decimal"/>
+      <w:lvlText w:val="%7."/>
+      <w:lvlJc w:val="left"/>
+      <w:pPr>
+        <w:ind w:left="5040" w:hanging="360"/>
+      </w:pPr>
+    </w:lvl>
+    <w:lvl w:ilvl="7" w:tplc="240A0019" w:tentative="1">
+      <w:start w:val="1"/>
+      <w:numFmt w:val="lowerLetter"/>
+      <w:lvlText w:val="%8."/>
+      <w:lvlJc w:val="left"/>
+      <w:pPr>
+        <w:ind w:left="5760" w:hanging="360"/>
+      </w:pPr>
+    </w:lvl>
+    <w:lvl w:ilvl="8" w:tplc="240A001B" w:tentative="1">
+      <w:start w:val="1"/>
+      <w:numFmt w:val="lowerRoman"/>
+      <w:lvlText w:val="%9."/>
+      <w:lvlJc w:val="right"/>
+      <w:pPr>
+        <w:ind w:left="6480" w:hanging="180"/>
+      </w:pPr>
+    </w:lvl>
+  </w:abstractNum>
+  <w:abstractNum w:abstractNumId="11" w15:restartNumberingAfterBreak="0">
     <w:nsid w:val="78941A71"/>
     <w:multiLevelType w:val="hybridMultilevel"/>
     <w:tmpl w:val="CD8601A4"/>
@@ -3628,31 +5397,40 @@
     </w:lvl>
   </w:abstractNum>
   <w:num w:numId="1">
+    <w:abstractNumId w:val="2"/>
+  </w:num>
+  <w:num w:numId="2">
+    <w:abstractNumId w:val="4"/>
+  </w:num>
+  <w:num w:numId="3">
+    <w:abstractNumId w:val="5"/>
+  </w:num>
+  <w:num w:numId="4">
+    <w:abstractNumId w:val="3"/>
+  </w:num>
+  <w:num w:numId="5">
+    <w:abstractNumId w:val="8"/>
+  </w:num>
+  <w:num w:numId="6">
+    <w:abstractNumId w:val="11"/>
+  </w:num>
+  <w:num w:numId="7">
     <w:abstractNumId w:val="1"/>
   </w:num>
-  <w:num w:numId="2">
-    <w:abstractNumId w:val="3"/>
+  <w:num w:numId="8">
+    <w:abstractNumId w:val="9"/>
   </w:num>
-  <w:num w:numId="3">
-    <w:abstractNumId w:val="4"/>
+  <w:num w:numId="9">
+    <w:abstractNumId w:val="7"/>
   </w:num>
-  <w:num w:numId="4">
-    <w:abstractNumId w:val="2"/>
+  <w:num w:numId="10">
+    <w:abstractNumId w:val="10"/>
   </w:num>
-  <w:num w:numId="5">
+  <w:num w:numId="11">
     <w:abstractNumId w:val="6"/>
   </w:num>
-  <w:num w:numId="6">
-    <w:abstractNumId w:val="8"/>
-  </w:num>
-  <w:num w:numId="7">
+  <w:num w:numId="12">
     <w:abstractNumId w:val="0"/>
-  </w:num>
-  <w:num w:numId="8">
-    <w:abstractNumId w:val="7"/>
-  </w:num>
-  <w:num w:numId="9">
-    <w:abstractNumId w:val="5"/>
   </w:num>
 </w:numbering>
 </file>

</xml_diff>